<commit_message>
docs: add Sprint 1.5 — Scenario Integrity Engine + two-library model
Insert a deterministic Scenario Integrity Engine between the Scenario
Builder and the Script Composer. It certifies the canonical scenario
(persona, coverage polarity, test-data suitability, expected-result
consistency, step completeness, preconditions, grounding) and computes an
Automation Readiness Score. Report-only: never mutates scenario data — the
Scenario Builder stays the sole owner.

Frames the system around exactly two deterministic rule libraries:
Scenario Integrity Engine (is the input correct?) + Engineering Heuristics
Library (what's the best implementation?). No third intelligence layer.

Updates: frozen pipeline diagram, stage/component maps, long-term roadmap
(Phase 1.5), and sequencing (Sprint 1.5 stable before Sprint 2). Proposed
home src/engines/scenario-integrity/. Docs-only.
</commit_message>
<xml_diff>
--- a/SCRIPT_COMPOSER_EVOLUTION.docx
+++ b/SCRIPT_COMPOSER_EVOLUTION.docx
@@ -2,7 +2,7 @@
 <file path=word/document.xml><?xml version="1.0" encoding="utf-8"?>
 <w:document xmlns:w="http://schemas.openxmlformats.org/wordprocessingml/2006/main" xmlns:m="http://schemas.openxmlformats.org/officeDocument/2006/math" xmlns:r="http://schemas.openxmlformats.org/officeDocument/2006/relationships" xmlns:o="urn:schemas-microsoft-com:office:office" xmlns:v="urn:schemas-microsoft-com:vml" xmlns:w10="urn:schemas-microsoft-com:office:word" xmlns:a="http://schemas.openxmlformats.org/drawingml/2006/main" xmlns:pic="http://schemas.openxmlformats.org/drawingml/2006/picture" xmlns:wp="http://schemas.openxmlformats.org/drawingml/2006/wordprocessingDrawing">
   <w:body>
-    <w:bookmarkStart w:id="46" w:name="Xa3ce195b62cb99a8b10351ab1cd937415b67cc6"/>
+    <w:bookmarkStart w:id="52" w:name="Xa3ce195b62cb99a8b10351ab1cd937415b67cc6"/>
     <w:p>
       <w:pPr>
         <w:pStyle w:val="Heading1"/>
@@ -211,7 +211,7 @@
         <w:t xml:space="preserve"> </w:t>
       </w:r>
       <w:r>
-        <w:t xml:space="preserve">(Sprints 1–7 + the Engineering Heuristics Library) that raises generated-code quality without</w:t>
+        <w:t xml:space="preserve">(Sprints 1, 1.5, 2–7 + the two deterministic rule libraries) that raises generated-code quality without</w:t>
       </w:r>
       <w:r>
         <w:t xml:space="preserve"> </w:t>
@@ -607,6 +607,24 @@
         <w:rPr>
           <w:rStyle w:val="VerbatimChar"/>
         </w:rPr>
+        <w:t xml:space="preserve">Scenario Integrity Engine (certifies the scenario; warnings only, never mutates — Sprint 1.5)</w:t>
+      </w:r>
+      <w:r>
+        <w:br/>
+      </w:r>
+      <w:r>
+        <w:rPr>
+          <w:rStyle w:val="VerbatimChar"/>
+        </w:rPr>
+        <w:t xml:space="preserve">    ↓</w:t>
+      </w:r>
+      <w:r>
+        <w:br/>
+      </w:r>
+      <w:r>
+        <w:rPr>
+          <w:rStyle w:val="VerbatimChar"/>
+        </w:rPr>
         <w:t xml:space="preserve">Canonical Scenario        (grounding[] + structured expected, one source of truth)</w:t>
       </w:r>
       <w:r>
@@ -680,6 +698,102 @@
           <w:rStyle w:val="VerbatimChar"/>
         </w:rPr>
         <w:t xml:space="preserve">Persist                   (generated_test_cases / scripts + ai_metadata)</w:t>
+      </w:r>
+    </w:p>
+    <w:p>
+      <w:pPr>
+        <w:pStyle w:val="BlockText"/>
+      </w:pPr>
+      <w:r>
+        <w:t xml:space="preserve">The</w:t>
+      </w:r>
+      <w:r>
+        <w:t xml:space="preserve"> </w:t>
+      </w:r>
+      <w:r>
+        <w:rPr>
+          <w:bCs/>
+          <w:b/>
+        </w:rPr>
+        <w:t xml:space="preserve">Scenario Integrity Engine</w:t>
+      </w:r>
+      <w:r>
+        <w:t xml:space="preserve"> </w:t>
+      </w:r>
+      <w:r>
+        <w:t xml:space="preserve">is a deterministic certifier inserted between the Scenario</w:t>
+      </w:r>
+      <w:r>
+        <w:t xml:space="preserve"> </w:t>
+      </w:r>
+      <w:r>
+        <w:t xml:space="preserve">Builder and everything downstream. It does</w:t>
+      </w:r>
+      <w:r>
+        <w:t xml:space="preserve"> </w:t>
+      </w:r>
+      <w:r>
+        <w:rPr>
+          <w:bCs/>
+          <w:b/>
+        </w:rPr>
+        <w:t xml:space="preserve">not</w:t>
+      </w:r>
+      <w:r>
+        <w:t xml:space="preserve"> </w:t>
+      </w:r>
+      <w:r>
+        <w:t xml:space="preserve">own or mutate scenario data — the Scenario</w:t>
+      </w:r>
+      <w:r>
+        <w:t xml:space="preserve"> </w:t>
+      </w:r>
+      <w:r>
+        <w:t xml:space="preserve">Builder remains the sole owner. It only answers:</w:t>
+      </w:r>
+      <w:r>
+        <w:t xml:space="preserve"> </w:t>
+      </w:r>
+      <w:r>
+        <w:rPr>
+          <w:iCs/>
+          <w:i/>
+        </w:rPr>
+        <w:t xml:space="preserve">“</w:t>
+      </w:r>
+      <w:r>
+        <w:rPr>
+          <w:iCs/>
+          <w:i/>
+        </w:rPr>
+        <w:t xml:space="preserve">Is this canonical scenario internally</w:t>
+      </w:r>
+      <w:r>
+        <w:rPr>
+          <w:iCs/>
+          <w:i/>
+        </w:rPr>
+        <w:t xml:space="preserve"> </w:t>
+      </w:r>
+      <w:r>
+        <w:rPr>
+          <w:iCs/>
+          <w:i/>
+        </w:rPr>
+        <w:t xml:space="preserve">consistent and automation-ready?</w:t>
+      </w:r>
+      <w:r>
+        <w:rPr>
+          <w:iCs/>
+          <w:i/>
+        </w:rPr>
+        <w:t xml:space="preserve">”</w:t>
+      </w:r>
+      <w:r>
+        <w:t xml:space="preserve"> </w:t>
+      </w:r>
+      <w:r>
+        <w:t xml:space="preserve">and attaches a readiness score + warnings. See Sprint 1.5.</w:t>
       </w:r>
     </w:p>
     <w:bookmarkStart w:id="25" w:name="X77d27206a19a50fa725fba6f0d1f9ca59b682e6"/>
@@ -755,6 +869,49 @@
                 <w:rStyle w:val="VerbatimChar"/>
               </w:rPr>
               <w:t xml:space="preserve">src/engines/scenario-builder.ts</w:t>
+            </w:r>
+          </w:p>
+        </w:tc>
+      </w:tr>
+      <w:tr>
+        <w:tc>
+          <w:tcPr/>
+          <w:p>
+            <w:pPr>
+              <w:pStyle w:val="Compact"/>
+              <w:jc w:val="left"/>
+            </w:pPr>
+            <w:r>
+              <w:rPr>
+                <w:bCs/>
+                <w:b/>
+              </w:rPr>
+              <w:t xml:space="preserve">Scenario Integrity Engine</w:t>
+            </w:r>
+          </w:p>
+        </w:tc>
+        <w:tc>
+          <w:tcPr/>
+          <w:p>
+            <w:pPr>
+              <w:pStyle w:val="Compact"/>
+              <w:jc w:val="left"/>
+            </w:pPr>
+            <w:r>
+              <w:rPr>
+                <w:rStyle w:val="VerbatimChar"/>
+              </w:rPr>
+              <w:t xml:space="preserve">src/engines/scenario-integrity/</w:t>
+            </w:r>
+            <w:r>
+              <w:t xml:space="preserve"> </w:t>
+            </w:r>
+            <w:r>
+              <w:rPr>
+                <w:iCs/>
+                <w:i/>
+              </w:rPr>
+              <w:t xml:space="preserve">(proposed — Sprint 1.5)</w:t>
             </w:r>
           </w:p>
         </w:tc>
@@ -1633,7 +1790,7 @@
       </w:r>
     </w:p>
     <w:bookmarkEnd w:id="27"/>
-    <w:bookmarkStart w:id="40" w:name="roadmap"/>
+    <w:bookmarkStart w:id="45" w:name="roadmap"/>
     <w:p>
       <w:pPr>
         <w:pStyle w:val="Heading2"/>
@@ -1772,13 +1929,13 @@
       </w:r>
     </w:p>
     <w:bookmarkEnd w:id="28"/>
-    <w:bookmarkStart w:id="33" w:name="X9f34fcb1734506be7ac3d74ae2dafe6a5acd6ae"/>
+    <w:bookmarkStart w:id="33" w:name="X8738fb454b9b9f8b9483705ff00d5ace0d2f237"/>
     <w:p>
       <w:pPr>
         <w:pStyle w:val="Heading3"/>
       </w:pPr>
       <w:r>
-        <w:t xml:space="preserve">Sprint 2 — Locator Ranking Engine ⭐⭐⭐⭐⭐ (highest ROI)</w:t>
+        <w:t xml:space="preserve">Sprint 1.5 — Scenario Integrity Engine ⭐⭐⭐⭐⭐ (do before Sprint 2)</w:t>
       </w:r>
     </w:p>
     <w:p>
@@ -1786,57 +1943,132 @@
         <w:pStyle w:val="FirstParagraph"/>
       </w:pPr>
       <w:r>
-        <w:t xml:space="preserve">This is</w:t>
-      </w:r>
-      <w:r>
-        <w:t xml:space="preserve"> </w:t>
-      </w:r>
-      <w:r>
-        <w:rPr>
-          <w:bCs/>
-          <w:b/>
-        </w:rPr>
-        <w:t xml:space="preserve">not</w:t>
-      </w:r>
-      <w:r>
-        <w:t xml:space="preserve"> </w:t>
-      </w:r>
-      <w:r>
+        <w:t xml:space="preserve">A deterministic</w:t>
+      </w:r>
+      <w:r>
+        <w:t xml:space="preserve"> </w:t>
+      </w:r>
+      <w:r>
+        <w:rPr>
+          <w:bCs/>
+          <w:b/>
+        </w:rPr>
+        <w:t xml:space="preserve">certifier</w:t>
+      </w:r>
+      <w:r>
+        <w:t xml:space="preserve"> </w:t>
+      </w:r>
+      <w:r>
+        <w:t xml:space="preserve">that sits between the Scenario Builder and the Script Composer. It is</w:t>
+      </w:r>
+      <w:r>
+        <w:t xml:space="preserve"> </w:t>
+      </w:r>
+      <w:r>
+        <w:rPr>
+          <w:bCs/>
+          <w:b/>
+        </w:rPr>
+        <w:t xml:space="preserve">not new intelligence</w:t>
+      </w:r>
+      <w:r>
+        <w:t xml:space="preserve"> </w:t>
+      </w:r>
+      <w:r>
+        <w:t xml:space="preserve">— no LLM, no generation. It answers one question:</w:t>
+      </w:r>
+    </w:p>
+    <w:p>
+      <w:pPr>
+        <w:pStyle w:val="BlockText"/>
+      </w:pPr>
+      <w:r>
+        <w:rPr>
+          <w:bCs/>
+          <w:b/>
+        </w:rPr>
         <w:t xml:space="preserve">“</w:t>
       </w:r>
       <w:r>
-        <w:t xml:space="preserve">better locators.</w:t>
-      </w:r>
-      <w:r>
+        <w:rPr>
+          <w:bCs/>
+          <w:b/>
+        </w:rPr>
+        <w:t xml:space="preserve">Is this canonical scenario internally consistent and automation-ready?</w:t>
+      </w:r>
+      <w:r>
+        <w:rPr>
+          <w:bCs/>
+          <w:b/>
+        </w:rPr>
         <w:t xml:space="preserve">”</w:t>
       </w:r>
-      <w:r>
-        <w:t xml:space="preserve"> </w:t>
-      </w:r>
-      <w:r>
-        <w:t xml:space="preserve">It is</w:t>
-      </w:r>
-      <w:r>
-        <w:t xml:space="preserve"> </w:t>
-      </w:r>
-      <w:r>
-        <w:rPr>
-          <w:bCs/>
-          <w:b/>
-        </w:rPr>
-        <w:t xml:space="preserve">better locator decision-making.</w:t>
-      </w:r>
-    </w:p>
-    <w:p>
-      <w:pPr>
-        <w:pStyle w:val="BodyText"/>
-      </w:pPr>
-      <w:r>
-        <w:rPr>
-          <w:bCs/>
-          <w:b/>
-        </w:rPr>
-        <w:t xml:space="preserve">Today</w:t>
+    </w:p>
+    <w:p>
+      <w:pPr>
+        <w:pStyle w:val="FirstParagraph"/>
+      </w:pPr>
+      <w:r>
+        <w:t xml:space="preserve">Today the Script Composer sometimes</w:t>
+      </w:r>
+      <w:r>
+        <w:t xml:space="preserve"> </w:t>
+      </w:r>
+      <w:r>
+        <w:rPr>
+          <w:iCs/>
+          <w:i/>
+        </w:rPr>
+        <w:t xml:space="preserve">compensates</w:t>
+      </w:r>
+      <w:r>
+        <w:t xml:space="preserve"> </w:t>
+      </w:r>
+      <w:r>
+        <w:t xml:space="preserve">for weak test cases. It shouldn’t have to. If the</w:t>
+      </w:r>
+      <w:r>
+        <w:t xml:space="preserve"> </w:t>
+      </w:r>
+      <w:r>
+        <w:t xml:space="preserve">Composer always receives a high-quality, certified scenario, locator / assertion / coverage mistakes</w:t>
+      </w:r>
+      <w:r>
+        <w:t xml:space="preserve"> </w:t>
+      </w:r>
+      <w:r>
+        <w:t xml:space="preserve">drop</w:t>
+      </w:r>
+      <w:r>
+        <w:t xml:space="preserve"> </w:t>
+      </w:r>
+      <w:r>
+        <w:rPr>
+          <w:bCs/>
+          <w:b/>
+        </w:rPr>
+        <w:t xml:space="preserve">without touching generation.</w:t>
+      </w:r>
+      <w:r>
+        <w:t xml:space="preserve"> </w:t>
+      </w:r>
+      <w:r>
+        <w:t xml:space="preserve">This is the first of the two deterministic rule libraries (see</w:t>
+      </w:r>
+      <w:r>
+        <w:t xml:space="preserve"> </w:t>
+      </w:r>
+      <w:r>
+        <w:t xml:space="preserve">§5) and the natural partner to the Engineering Heuristics Library.</w:t>
+      </w:r>
+    </w:p>
+    <w:bookmarkStart w:id="29" w:name="hard-rule-report-never-rewrite"/>
+    <w:p>
+      <w:pPr>
+        <w:pStyle w:val="Heading4"/>
+      </w:pPr>
+      <w:r>
+        <w:t xml:space="preserve">Hard rule: report, never rewrite</w:t>
       </w:r>
     </w:p>
     <w:p>
@@ -1847,7 +2079,16 @@
         <w:rPr>
           <w:rStyle w:val="VerbatimChar"/>
         </w:rPr>
-        <w:t xml:space="preserve">Grounding → Selector</w:t>
+        <w:t xml:space="preserve">Scenario → Validator → Issues → (same) Scenario     ✅</w:t>
+      </w:r>
+      <w:r>
+        <w:br/>
+      </w:r>
+      <w:r>
+        <w:rPr>
+          <w:rStyle w:val="VerbatimChar"/>
+        </w:rPr>
+        <w:t xml:space="preserve">Scenario → Validator → Scenario rewritten           ❌  (forbidden)</w:t>
       </w:r>
     </w:p>
     <w:p>
@@ -1855,49 +2096,39 @@
         <w:pStyle w:val="FirstParagraph"/>
       </w:pPr>
       <w:r>
-        <w:rPr>
-          <w:bCs/>
-          <w:b/>
-        </w:rPr>
-        <w:t xml:space="preserve">Target</w:t>
-      </w:r>
-    </w:p>
-    <w:p>
-      <w:pPr>
-        <w:pStyle w:val="SourceCode"/>
-      </w:pPr>
-      <w:r>
-        <w:rPr>
-          <w:rStyle w:val="VerbatimChar"/>
-        </w:rPr>
-        <w:t xml:space="preserve">Grounding → Candidate Discovery → Candidate Ranking → Candidate Selection → Confidence</w:t>
-      </w:r>
-    </w:p>
-    <w:bookmarkStart w:id="29" w:name="Xa02d250f0771bf4568bfba6e027c46031cd190c"/>
+        <w:t xml:space="preserve">The Scenario Builder remains the</w:t>
+      </w:r>
+      <w:r>
+        <w:t xml:space="preserve"> </w:t>
+      </w:r>
+      <w:r>
+        <w:rPr>
+          <w:bCs/>
+          <w:b/>
+        </w:rPr>
+        <w:t xml:space="preserve">sole owner</w:t>
+      </w:r>
+      <w:r>
+        <w:t xml:space="preserve"> </w:t>
+      </w:r>
+      <w:r>
+        <w:t xml:space="preserve">of scenario data. The Integrity Engine only attaches</w:t>
+      </w:r>
+      <w:r>
+        <w:t xml:space="preserve"> </w:t>
+      </w:r>
+      <w:r>
+        <w:t xml:space="preserve">quality signals (warnings + a readiness score); it never mutates steps, grounding, or expected.</w:t>
+      </w:r>
+    </w:p>
+    <w:bookmarkEnd w:id="29"/>
+    <w:bookmarkStart w:id="30" w:name="what-it-validates"/>
     <w:p>
       <w:pPr>
         <w:pStyle w:val="Heading4"/>
       </w:pPr>
       <w:r>
-        <w:t xml:space="preserve">4.1 Candidate Discovery — collect, do not select</w:t>
-      </w:r>
-    </w:p>
-    <w:p>
-      <w:pPr>
-        <w:pStyle w:val="FirstParagraph"/>
-      </w:pPr>
-      <w:r>
-        <w:t xml:space="preserve">Gather candidates from every source, in priority order.</w:t>
-      </w:r>
-      <w:r>
-        <w:t xml:space="preserve"> </w:t>
-      </w:r>
-      <w:r>
-        <w:rPr>
-          <w:bCs/>
-          <w:b/>
-        </w:rPr>
-        <w:t xml:space="preserve">Do not choose yet.</w:t>
+        <w:t xml:space="preserve">What it validates</w:t>
       </w:r>
     </w:p>
     <w:p>
@@ -1909,23 +2140,109 @@
         <w:pStyle w:val="Compact"/>
       </w:pPr>
       <w:r>
-        <w:t xml:space="preserve">Existing</w:t>
-      </w:r>
-      <w:r>
-        <w:t xml:space="preserve"> </w:t>
-      </w:r>
-      <w:r>
-        <w:rPr>
-          <w:bCs/>
-          <w:b/>
-        </w:rPr>
-        <w:t xml:space="preserve">Page Object</w:t>
-      </w:r>
-      <w:r>
-        <w:t xml:space="preserve"> </w:t>
-      </w:r>
-      <w:r>
-        <w:t xml:space="preserve">methods (reuse wins)</w:t>
+        <w:rPr>
+          <w:bCs/>
+          <w:b/>
+        </w:rPr>
+        <w:t xml:space="preserve">Persona consistency</w:t>
+      </w:r>
+      <w:r>
+        <w:t xml:space="preserve"> </w:t>
+      </w:r>
+      <w:r>
+        <w:t xml:space="preserve">⭐⭐⭐⭐⭐ — the persona/test data must match the scenario intent.</w:t>
+      </w:r>
+    </w:p>
+    <w:p>
+      <w:pPr>
+        <w:numPr>
+          <w:ilvl w:val="1"/>
+          <w:numId w:val="1005"/>
+        </w:numPr>
+        <w:pStyle w:val="Compact"/>
+      </w:pPr>
+      <w:r>
+        <w:rPr>
+          <w:rStyle w:val="VerbatimChar"/>
+        </w:rPr>
+        <w:t xml:space="preserve">Title: Login with locked user</w:t>
+      </w:r>
+      <w:r>
+        <w:t xml:space="preserve"> </w:t>
+      </w:r>
+      <w:r>
+        <w:t xml:space="preserve">+</w:t>
+      </w:r>
+      <w:r>
+        <w:t xml:space="preserve"> </w:t>
+      </w:r>
+      <w:r>
+        <w:rPr>
+          <w:rStyle w:val="VerbatimChar"/>
+        </w:rPr>
+        <w:t xml:space="preserve">Test Data: standard_user</w:t>
+      </w:r>
+      <w:r>
+        <w:t xml:space="preserve"> </w:t>
+      </w:r>
+      <w:r>
+        <w:t xml:space="preserve">→</w:t>
+      </w:r>
+      <w:r>
+        <w:t xml:space="preserve"> </w:t>
+      </w:r>
+      <w:r>
+        <w:rPr>
+          <w:bCs/>
+          <w:b/>
+        </w:rPr>
+        <w:t xml:space="preserve">fail</w:t>
+      </w:r>
+    </w:p>
+    <w:p>
+      <w:pPr>
+        <w:numPr>
+          <w:ilvl w:val="1"/>
+          <w:numId w:val="1005"/>
+        </w:numPr>
+        <w:pStyle w:val="Compact"/>
+      </w:pPr>
+      <w:r>
+        <w:rPr>
+          <w:rStyle w:val="VerbatimChar"/>
+        </w:rPr>
+        <w:t xml:space="preserve">Title: Successful login</w:t>
+      </w:r>
+      <w:r>
+        <w:t xml:space="preserve"> </w:t>
+      </w:r>
+      <w:r>
+        <w:t xml:space="preserve">+</w:t>
+      </w:r>
+      <w:r>
+        <w:t xml:space="preserve"> </w:t>
+      </w:r>
+      <w:r>
+        <w:rPr>
+          <w:rStyle w:val="VerbatimChar"/>
+        </w:rPr>
+        <w:t xml:space="preserve">Expected: Authentication rejected</w:t>
+      </w:r>
+      <w:r>
+        <w:t xml:space="preserve"> </w:t>
+      </w:r>
+      <w:r>
+        <w:t xml:space="preserve">→</w:t>
+      </w:r>
+      <w:r>
+        <w:t xml:space="preserve"> </w:t>
+      </w:r>
+      <w:r>
+        <w:rPr>
+          <w:bCs/>
+          <w:b/>
+        </w:rPr>
+        <w:t xml:space="preserve">fail</w:t>
       </w:r>
     </w:p>
     <w:p>
@@ -1941,13 +2258,61 @@
           <w:bCs/>
           <w:b/>
         </w:rPr>
-        <w:t xml:space="preserve">App Profile</w:t>
-      </w:r>
-      <w:r>
-        <w:t xml:space="preserve"> </w:t>
-      </w:r>
-      <w:r>
-        <w:t xml:space="preserve">(crawled grounding)</w:t>
+        <w:t xml:space="preserve">Coverage polarity</w:t>
+      </w:r>
+      <w:r>
+        <w:t xml:space="preserve"> </w:t>
+      </w:r>
+      <w:r>
+        <w:t xml:space="preserve">⭐⭐⭐⭐⭐ — expected outcome must match the coverage type (deterministic):</w:t>
+      </w:r>
+    </w:p>
+    <w:p>
+      <w:pPr>
+        <w:numPr>
+          <w:ilvl w:val="1"/>
+          <w:numId w:val="1006"/>
+        </w:numPr>
+        <w:pStyle w:val="Compact"/>
+      </w:pPr>
+      <w:r>
+        <w:t xml:space="preserve">positive → success state (e.g. dashboard displayed)</w:t>
+      </w:r>
+    </w:p>
+    <w:p>
+      <w:pPr>
+        <w:numPr>
+          <w:ilvl w:val="1"/>
+          <w:numId w:val="1006"/>
+        </w:numPr>
+        <w:pStyle w:val="Compact"/>
+      </w:pPr>
+      <w:r>
+        <w:t xml:space="preserve">negative → error shown</w:t>
+      </w:r>
+    </w:p>
+    <w:p>
+      <w:pPr>
+        <w:numPr>
+          <w:ilvl w:val="1"/>
+          <w:numId w:val="1006"/>
+        </w:numPr>
+        <w:pStyle w:val="Compact"/>
+      </w:pPr>
+      <w:r>
+        <w:t xml:space="preserve">edge → graceful validation</w:t>
+      </w:r>
+    </w:p>
+    <w:p>
+      <w:pPr>
+        <w:numPr>
+          <w:ilvl w:val="1"/>
+          <w:numId w:val="1006"/>
+        </w:numPr>
+        <w:pStyle w:val="Compact"/>
+      </w:pPr>
+      <w:r>
+        <w:t xml:space="preserve">boundary → limit accepted/rejected</w:t>
       </w:r>
     </w:p>
     <w:p>
@@ -1963,13 +2328,59 @@
           <w:bCs/>
           <w:b/>
         </w:rPr>
-        <w:t xml:space="preserve">Test Case</w:t>
-      </w:r>
-      <w:r>
-        <w:t xml:space="preserve"> </w:t>
-      </w:r>
-      <w:r>
-        <w:t xml:space="preserve">wording</w:t>
+        <w:t xml:space="preserve">Test-data suitability</w:t>
+      </w:r>
+      <w:r>
+        <w:t xml:space="preserve"> </w:t>
+      </w:r>
+      <w:r>
+        <w:t xml:space="preserve">⭐⭐⭐⭐⭐ — dataset must fit the scenario.</w:t>
+      </w:r>
+    </w:p>
+    <w:p>
+      <w:pPr>
+        <w:numPr>
+          <w:ilvl w:val="1"/>
+          <w:numId w:val="1007"/>
+        </w:numPr>
+        <w:pStyle w:val="Compact"/>
+      </w:pPr>
+      <w:r>
+        <w:rPr>
+          <w:rStyle w:val="VerbatimChar"/>
+        </w:rPr>
+        <w:t xml:space="preserve">valid login</w:t>
+      </w:r>
+      <w:r>
+        <w:t xml:space="preserve"> </w:t>
+      </w:r>
+      <w:r>
+        <w:t xml:space="preserve">scenario +</w:t>
+      </w:r>
+      <w:r>
+        <w:t xml:space="preserve"> </w:t>
+      </w:r>
+      <w:r>
+        <w:rPr>
+          <w:rStyle w:val="VerbatimChar"/>
+        </w:rPr>
+        <w:t xml:space="preserve">locked_user</w:t>
+      </w:r>
+      <w:r>
+        <w:t xml:space="preserve"> </w:t>
+      </w:r>
+      <w:r>
+        <w:t xml:space="preserve">dataset →</w:t>
+      </w:r>
+      <w:r>
+        <w:t xml:space="preserve"> </w:t>
+      </w:r>
+      <w:r>
+        <w:rPr>
+          <w:bCs/>
+          <w:b/>
+        </w:rPr>
+        <w:t xml:space="preserve">fail</w:t>
       </w:r>
     </w:p>
     <w:p>
@@ -1985,13 +2396,65 @@
           <w:bCs/>
           <w:b/>
         </w:rPr>
-        <w:t xml:space="preserve">Expected Result</w:t>
-      </w:r>
-      <w:r>
-        <w:t xml:space="preserve"> </w:t>
-      </w:r>
-      <w:r>
-        <w:t xml:space="preserve">text</w:t>
+        <w:t xml:space="preserve">Expected-result consistency</w:t>
+      </w:r>
+      <w:r>
+        <w:t xml:space="preserve"> </w:t>
+      </w:r>
+      <w:r>
+        <w:t xml:space="preserve">⭐⭐⭐⭐⭐ — manual outcome vs. structured expected must agree.</w:t>
+      </w:r>
+    </w:p>
+    <w:p>
+      <w:pPr>
+        <w:numPr>
+          <w:ilvl w:val="1"/>
+          <w:numId w:val="1008"/>
+        </w:numPr>
+        <w:pStyle w:val="Compact"/>
+      </w:pPr>
+      <w:r>
+        <w:t xml:space="preserve">manual</w:t>
+      </w:r>
+      <w:r>
+        <w:t xml:space="preserve"> </w:t>
+      </w:r>
+      <w:r>
+        <w:rPr>
+          <w:rStyle w:val="VerbatimChar"/>
+        </w:rPr>
+        <w:t xml:space="preserve">Login successful</w:t>
+      </w:r>
+      <w:r>
+        <w:t xml:space="preserve"> </w:t>
+      </w:r>
+      <w:r>
+        <w:t xml:space="preserve">+ expected</w:t>
+      </w:r>
+      <w:r>
+        <w:t xml:space="preserve"> </w:t>
+      </w:r>
+      <w:r>
+        <w:rPr>
+          <w:rStyle w:val="VerbatimChar"/>
+        </w:rPr>
+        <w:t xml:space="preserve">Error displayed</w:t>
+      </w:r>
+      <w:r>
+        <w:t xml:space="preserve"> </w:t>
+      </w:r>
+      <w:r>
+        <w:t xml:space="preserve">→</w:t>
+      </w:r>
+      <w:r>
+        <w:t xml:space="preserve"> </w:t>
+      </w:r>
+      <w:r>
+        <w:rPr>
+          <w:bCs/>
+          <w:b/>
+        </w:rPr>
+        <w:t xml:space="preserve">fail</w:t>
       </w:r>
     </w:p>
     <w:p>
@@ -2007,13 +2470,56 @@
           <w:bCs/>
           <w:b/>
         </w:rPr>
-        <w:t xml:space="preserve">Requirement</w:t>
-      </w:r>
-      <w:r>
-        <w:t xml:space="preserve"> </w:t>
-      </w:r>
-      <w:r>
-        <w:t xml:space="preserve">text</w:t>
+        <w:t xml:space="preserve">Step completeness</w:t>
+      </w:r>
+      <w:r>
+        <w:t xml:space="preserve"> </w:t>
+      </w:r>
+      <w:r>
+        <w:t xml:space="preserve">⭐⭐⭐⭐⭐ — steps must plausibly produce the expected outcome.</w:t>
+      </w:r>
+    </w:p>
+    <w:p>
+      <w:pPr>
+        <w:numPr>
+          <w:ilvl w:val="1"/>
+          <w:numId w:val="1009"/>
+        </w:numPr>
+        <w:pStyle w:val="Compact"/>
+      </w:pPr>
+      <w:r>
+        <w:rPr>
+          <w:rStyle w:val="VerbatimChar"/>
+        </w:rPr>
+        <w:t xml:space="preserve">Click Login</w:t>
+      </w:r>
+      <w:r>
+        <w:t xml:space="preserve"> </w:t>
+      </w:r>
+      <w:r>
+        <w:t xml:space="preserve">→ expected</w:t>
+      </w:r>
+      <w:r>
+        <w:t xml:space="preserve"> </w:t>
+      </w:r>
+      <w:r>
+        <w:rPr>
+          <w:rStyle w:val="VerbatimChar"/>
+        </w:rPr>
+        <w:t xml:space="preserve">Inventory page</w:t>
+      </w:r>
+      <w:r>
+        <w:t xml:space="preserve">, but no username/password entered →</w:t>
+      </w:r>
+      <w:r>
+        <w:t xml:space="preserve"> </w:t>
+      </w:r>
+      <w:r>
+        <w:rPr>
+          <w:bCs/>
+          <w:b/>
+        </w:rPr>
+        <w:t xml:space="preserve">incomplete, flag</w:t>
       </w:r>
     </w:p>
     <w:p>
@@ -2029,13 +2535,59 @@
           <w:bCs/>
           <w:b/>
         </w:rPr>
-        <w:t xml:space="preserve">DOM</w:t>
-      </w:r>
-      <w:r>
-        <w:t xml:space="preserve"> </w:t>
-      </w:r>
-      <w:r>
-        <w:t xml:space="preserve">relationships</w:t>
+        <w:t xml:space="preserve">Missing preconditions</w:t>
+      </w:r>
+      <w:r>
+        <w:t xml:space="preserve"> </w:t>
+      </w:r>
+      <w:r>
+        <w:t xml:space="preserve">⭐⭐⭐⭐⭐ — required preconditions must be present.</w:t>
+      </w:r>
+    </w:p>
+    <w:p>
+      <w:pPr>
+        <w:numPr>
+          <w:ilvl w:val="1"/>
+          <w:numId w:val="1010"/>
+        </w:numPr>
+        <w:pStyle w:val="Compact"/>
+      </w:pPr>
+      <w:r>
+        <w:rPr>
+          <w:rStyle w:val="VerbatimChar"/>
+        </w:rPr>
+        <w:t xml:space="preserve">Checkout</w:t>
+      </w:r>
+      <w:r>
+        <w:t xml:space="preserve"> </w:t>
+      </w:r>
+      <w:r>
+        <w:t xml:space="preserve">without</w:t>
+      </w:r>
+      <w:r>
+        <w:t xml:space="preserve"> </w:t>
+      </w:r>
+      <w:r>
+        <w:rPr>
+          <w:rStyle w:val="VerbatimChar"/>
+        </w:rPr>
+        <w:t xml:space="preserve">User logged in</w:t>
+      </w:r>
+      <w:r>
+        <w:t xml:space="preserve"> </w:t>
+      </w:r>
+      <w:r>
+        <w:t xml:space="preserve">→</w:t>
+      </w:r>
+      <w:r>
+        <w:t xml:space="preserve"> </w:t>
+      </w:r>
+      <w:r>
+        <w:rPr>
+          <w:bCs/>
+          <w:b/>
+        </w:rPr>
+        <w:t xml:space="preserve">flag</w:t>
       </w:r>
     </w:p>
     <w:p>
@@ -2051,155 +2603,54 @@
           <w:bCs/>
           <w:b/>
         </w:rPr>
-        <w:t xml:space="preserve">Accessibility</w:t>
-      </w:r>
-      <w:r>
-        <w:t xml:space="preserve"> </w:t>
-      </w:r>
-      <w:r>
-        <w:t xml:space="preserve">(role + name, aria-label, label association)</w:t>
+        <w:t xml:space="preserve">Grounding completeness</w:t>
+      </w:r>
+      <w:r>
+        <w:t xml:space="preserve"> </w:t>
+      </w:r>
+      <w:r>
+        <w:t xml:space="preserve">⭐⭐⭐⭐☆ — every actionable step should have grounding.</w:t>
       </w:r>
     </w:p>
     <w:p>
       <w:pPr>
         <w:numPr>
-          <w:ilvl w:val="0"/>
-          <w:numId w:val="1004"/>
+          <w:ilvl w:val="1"/>
+          <w:numId w:val="1011"/>
         </w:numPr>
         <w:pStyle w:val="Compact"/>
       </w:pPr>
       <w:r>
         <w:rPr>
-          <w:bCs/>
-          <w:b/>
-        </w:rPr>
-        <w:t xml:space="preserve">AI</w:t>
-      </w:r>
-      <w:r>
-        <w:t xml:space="preserve"> </w:t>
-      </w:r>
-      <w:r>
-        <w:t xml:space="preserve">— last resort only</w:t>
-      </w:r>
-    </w:p>
-    <w:p>
-      <w:pPr>
-        <w:pStyle w:val="BlockText"/>
-      </w:pPr>
-      <w:r>
-        <w:rPr>
-          <w:bCs/>
-          <w:b/>
-        </w:rPr>
-        <w:t xml:space="preserve">Fallback search chain before AI.</w:t>
-      </w:r>
-      <w:r>
-        <w:t xml:space="preserve"> </w:t>
-      </w:r>
-      <w:r>
-        <w:t xml:space="preserve">When the App Profile misses an element, do</w:t>
-      </w:r>
-      <w:r>
-        <w:t xml:space="preserve"> </w:t>
-      </w:r>
-      <w:r>
-        <w:rPr>
-          <w:bCs/>
-          <w:b/>
-        </w:rPr>
-        <w:t xml:space="preserve">not</w:t>
-      </w:r>
-      <w:r>
-        <w:t xml:space="preserve"> </w:t>
-      </w:r>
-      <w:r>
-        <w:t xml:space="preserve">jump to</w:t>
-      </w:r>
-      <w:r>
-        <w:t xml:space="preserve"> </w:t>
-      </w:r>
-      <w:r>
-        <w:t xml:space="preserve">the LLM. Search deterministically first:</w:t>
-      </w:r>
-    </w:p>
-    <w:p>
-      <w:pPr>
-        <w:pStyle w:val="SourceCode"/>
-      </w:pPr>
-      <w:r>
-        <w:rPr>
-          <w:rStyle w:val="VerbatimChar"/>
-        </w:rPr>
-        <w:t xml:space="preserve">Test Case → Keywords → Expected Result → Requirement → Page Object → DOM → AI</w:t>
-      </w:r>
-    </w:p>
-    <w:p>
-      <w:pPr>
-        <w:pStyle w:val="BlockText"/>
-      </w:pPr>
-      <w:r>
-        <w:t xml:space="preserve">Example — manual step</w:t>
-      </w:r>
-      <w:r>
-        <w:t xml:space="preserve"> </w:t>
-      </w:r>
-      <w:r>
-        <w:rPr>
-          <w:rStyle w:val="VerbatimChar"/>
-        </w:rPr>
-        <w:t xml:space="preserve">Click Login</w:t>
-      </w:r>
-      <w:r>
-        <w:t xml:space="preserve">, expected</w:t>
-      </w:r>
-      <w:r>
-        <w:t xml:space="preserve"> </w:t>
-      </w:r>
-      <w:r>
-        <w:rPr>
-          <w:rStyle w:val="VerbatimChar"/>
-        </w:rPr>
-        <w:t xml:space="preserve">Dashboard appears</w:t>
-      </w:r>
-      <w:r>
-        <w:t xml:space="preserve">: the composer infers Login</w:t>
-      </w:r>
-      <w:r>
-        <w:t xml:space="preserve"> </w:t>
-      </w:r>
-      <w:r>
-        <w:t xml:space="preserve">causes navigation and searches for</w:t>
-      </w:r>
-      <w:r>
-        <w:t xml:space="preserve"> </w:t>
-      </w:r>
-      <w:r>
-        <w:rPr>
-          <w:rStyle w:val="VerbatimChar"/>
-        </w:rPr>
-        <w:t xml:space="preserve">login / sign in / submit / authenticate</w:t>
-      </w:r>
-      <w:r>
-        <w:t xml:space="preserve"> </w:t>
-      </w:r>
-      <w:r>
-        <w:t xml:space="preserve">candidates instead</w:t>
-      </w:r>
-      <w:r>
-        <w:t xml:space="preserve"> </w:t>
-      </w:r>
-      <w:r>
-        <w:t xml:space="preserve">of hallucinating a selector.</w:t>
-      </w:r>
-    </w:p>
-    <w:bookmarkEnd w:id="29"/>
-    <w:bookmarkStart w:id="30" w:name="candidate-ranking-score-every-candidate"/>
+          <w:rStyle w:val="VerbatimChar"/>
+        </w:rPr>
+        <w:t xml:space="preserve">Enter username</w:t>
+      </w:r>
+      <w:r>
+        <w:t xml:space="preserve"> </w:t>
+      </w:r>
+      <w:r>
+        <w:t xml:space="preserve">with no grounding →</w:t>
+      </w:r>
+      <w:r>
+        <w:t xml:space="preserve"> </w:t>
+      </w:r>
+      <w:r>
+        <w:rPr>
+          <w:bCs/>
+          <w:b/>
+        </w:rPr>
+        <w:t xml:space="preserve">do not fail; reduce confidence.</w:t>
+      </w:r>
+    </w:p>
+    <w:bookmarkEnd w:id="30"/>
+    <w:bookmarkStart w:id="31" w:name="automation-readiness-score"/>
     <w:p>
       <w:pPr>
         <w:pStyle w:val="Heading4"/>
       </w:pPr>
       <w:r>
-        <w:t xml:space="preserve">4.2 Candidate Ranking — score every candidate</w:t>
+        <w:t xml:space="preserve">Automation Readiness Score</w:t>
       </w:r>
     </w:p>
     <w:p>
@@ -2207,22 +2658,17 @@
         <w:pStyle w:val="FirstParagraph"/>
       </w:pPr>
       <w:r>
-        <w:t xml:space="preserve">Reuse/extend</w:t>
-      </w:r>
-      <w:r>
-        <w:t xml:space="preserve"> </w:t>
-      </w:r>
-      <w:r>
-        <w:rPr>
-          <w:rStyle w:val="VerbatimChar"/>
-        </w:rPr>
-        <w:t xml:space="preserve">core/candidate-ranker.ts</w:t>
-      </w:r>
-      <w:r>
-        <w:t xml:space="preserve"> </w:t>
-      </w:r>
-      <w:r>
-        <w:t xml:space="preserve">scoring. Indicative scores:</w:t>
+        <w:t xml:space="preserve">Before the Script Composer starts, the engine computes a scenario-quality score so the Composer knows</w:t>
+      </w:r>
+      <w:r>
+        <w:t xml:space="preserve"> </w:t>
+      </w:r>
+      <w:r>
+        <w:rPr>
+          <w:bCs/>
+          <w:b/>
+        </w:rPr>
+        <w:t xml:space="preserve">how much to trust the scenario:</w:t>
       </w:r>
     </w:p>
     <w:tbl>
@@ -2247,6 +2693,855 @@
               <w:jc w:val="left"/>
             </w:pPr>
             <w:r>
+              <w:t xml:space="preserve">Check</w:t>
+            </w:r>
+          </w:p>
+        </w:tc>
+        <w:tc>
+          <w:tcPr/>
+          <w:p>
+            <w:pPr>
+              <w:pStyle w:val="Compact"/>
+              <w:jc w:val="center"/>
+            </w:pPr>
+            <w:r>
+              <w:t xml:space="preserve">Result</w:t>
+            </w:r>
+          </w:p>
+        </w:tc>
+      </w:tr>
+      <w:tr>
+        <w:tc>
+          <w:tcPr/>
+          <w:p>
+            <w:pPr>
+              <w:pStyle w:val="Compact"/>
+              <w:jc w:val="left"/>
+            </w:pPr>
+            <w:r>
+              <w:t xml:space="preserve">Persona</w:t>
+            </w:r>
+          </w:p>
+        </w:tc>
+        <w:tc>
+          <w:tcPr/>
+          <w:p>
+            <w:pPr>
+              <w:pStyle w:val="Compact"/>
+              <w:jc w:val="center"/>
+            </w:pPr>
+            <w:r>
+              <w:t xml:space="preserve">✅</w:t>
+            </w:r>
+          </w:p>
+        </w:tc>
+      </w:tr>
+      <w:tr>
+        <w:tc>
+          <w:tcPr/>
+          <w:p>
+            <w:pPr>
+              <w:pStyle w:val="Compact"/>
+              <w:jc w:val="left"/>
+            </w:pPr>
+            <w:r>
+              <w:t xml:space="preserve">Expected</w:t>
+            </w:r>
+          </w:p>
+        </w:tc>
+        <w:tc>
+          <w:tcPr/>
+          <w:p>
+            <w:pPr>
+              <w:pStyle w:val="Compact"/>
+              <w:jc w:val="center"/>
+            </w:pPr>
+            <w:r>
+              <w:t xml:space="preserve">✅</w:t>
+            </w:r>
+          </w:p>
+        </w:tc>
+      </w:tr>
+      <w:tr>
+        <w:tc>
+          <w:tcPr/>
+          <w:p>
+            <w:pPr>
+              <w:pStyle w:val="Compact"/>
+              <w:jc w:val="left"/>
+            </w:pPr>
+            <w:r>
+              <w:t xml:space="preserve">Preconditions</w:t>
+            </w:r>
+          </w:p>
+        </w:tc>
+        <w:tc>
+          <w:tcPr/>
+          <w:p>
+            <w:pPr>
+              <w:pStyle w:val="Compact"/>
+              <w:jc w:val="center"/>
+            </w:pPr>
+            <w:r>
+              <w:t xml:space="preserve">✅</w:t>
+            </w:r>
+          </w:p>
+        </w:tc>
+      </w:tr>
+      <w:tr>
+        <w:tc>
+          <w:tcPr/>
+          <w:p>
+            <w:pPr>
+              <w:pStyle w:val="Compact"/>
+              <w:jc w:val="left"/>
+            </w:pPr>
+            <w:r>
+              <w:t xml:space="preserve">Grounding</w:t>
+            </w:r>
+          </w:p>
+        </w:tc>
+        <w:tc>
+          <w:tcPr/>
+          <w:p>
+            <w:pPr>
+              <w:pStyle w:val="Compact"/>
+              <w:jc w:val="center"/>
+            </w:pPr>
+            <w:r>
+              <w:t xml:space="preserve">⚠️</w:t>
+            </w:r>
+          </w:p>
+        </w:tc>
+      </w:tr>
+      <w:tr>
+        <w:tc>
+          <w:tcPr/>
+          <w:p>
+            <w:pPr>
+              <w:pStyle w:val="Compact"/>
+              <w:jc w:val="left"/>
+            </w:pPr>
+            <w:r>
+              <w:t xml:space="preserve">Test Data</w:t>
+            </w:r>
+          </w:p>
+        </w:tc>
+        <w:tc>
+          <w:tcPr/>
+          <w:p>
+            <w:pPr>
+              <w:pStyle w:val="Compact"/>
+              <w:jc w:val="center"/>
+            </w:pPr>
+            <w:r>
+              <w:t xml:space="preserve">✅</w:t>
+            </w:r>
+          </w:p>
+        </w:tc>
+      </w:tr>
+      <w:tr>
+        <w:tc>
+          <w:tcPr/>
+          <w:p>
+            <w:pPr>
+              <w:pStyle w:val="Compact"/>
+              <w:jc w:val="left"/>
+            </w:pPr>
+            <w:r>
+              <w:t xml:space="preserve">Coverage</w:t>
+            </w:r>
+          </w:p>
+        </w:tc>
+        <w:tc>
+          <w:tcPr/>
+          <w:p>
+            <w:pPr>
+              <w:pStyle w:val="Compact"/>
+              <w:jc w:val="center"/>
+            </w:pPr>
+            <w:r>
+              <w:t xml:space="preserve">✅</w:t>
+            </w:r>
+          </w:p>
+        </w:tc>
+      </w:tr>
+    </w:tbl>
+    <w:p>
+      <w:pPr>
+        <w:pStyle w:val="SourceCode"/>
+      </w:pPr>
+      <w:r>
+        <w:rPr>
+          <w:rStyle w:val="VerbatimChar"/>
+        </w:rPr>
+        <w:t xml:space="preserve">Scenario Ready — 96%</w:t>
+      </w:r>
+    </w:p>
+    <w:p>
+      <w:pPr>
+        <w:pStyle w:val="FirstParagraph"/>
+      </w:pPr>
+      <w:r>
+        <w:t xml:space="preserve">The score (and the per-check breakdown) is carried alongside the scenario and later feeds the Sprint 7</w:t>
+      </w:r>
+      <w:r>
+        <w:t xml:space="preserve"> </w:t>
+      </w:r>
+      <w:r>
+        <w:t xml:space="preserve">Confidence Engine and Smart TODOs — honest signal instead of silent compensation.</w:t>
+      </w:r>
+    </w:p>
+    <w:bookmarkEnd w:id="31"/>
+    <w:bookmarkStart w:id="32" w:name="where-it-lives"/>
+    <w:p>
+      <w:pPr>
+        <w:pStyle w:val="Heading4"/>
+      </w:pPr>
+      <w:r>
+        <w:t xml:space="preserve">Where it lives</w:t>
+      </w:r>
+    </w:p>
+    <w:p>
+      <w:pPr>
+        <w:pStyle w:val="FirstParagraph"/>
+      </w:pPr>
+      <w:r>
+        <w:rPr>
+          <w:rStyle w:val="VerbatimChar"/>
+        </w:rPr>
+        <w:t xml:space="preserve">src/engines/scenario-integrity/</w:t>
+      </w:r>
+      <w:r>
+        <w:t xml:space="preserve"> </w:t>
+      </w:r>
+      <w:r>
+        <w:t xml:space="preserve">— a pure, dependency-light rule module. Output is a typed</w:t>
+      </w:r>
+      <w:r>
+        <w:t xml:space="preserve"> </w:t>
+      </w:r>
+      <w:r>
+        <w:rPr>
+          <w:rStyle w:val="VerbatimChar"/>
+        </w:rPr>
+        <w:t xml:space="preserve">ScenarioIntegrityReport { readinessScore, checks[], warnings[] }</w:t>
+      </w:r>
+      <w:r>
+        <w:t xml:space="preserve"> </w:t>
+      </w:r>
+      <w:r>
+        <w:t xml:space="preserve">attached to the scenario. No stage</w:t>
+      </w:r>
+      <w:r>
+        <w:t xml:space="preserve"> </w:t>
+      </w:r>
+      <w:r>
+        <w:t xml:space="preserve">boundary moves; the Scenario Builder still owns the data.</w:t>
+      </w:r>
+    </w:p>
+    <w:p>
+      <w:pPr>
+        <w:pStyle w:val="BodyText"/>
+      </w:pPr>
+      <w:r>
+        <w:rPr>
+          <w:bCs/>
+          <w:b/>
+        </w:rPr>
+        <w:t xml:space="preserve">Milestones (ship small — measure after each):</w:t>
+      </w:r>
+      <w:r>
+        <w:t xml:space="preserve"> </w:t>
+      </w:r>
+      <w:r>
+        <w:t xml:space="preserve">-</w:t>
+      </w:r>
+      <w:r>
+        <w:t xml:space="preserve"> </w:t>
+      </w:r>
+      <w:r>
+        <w:rPr>
+          <w:bCs/>
+          <w:b/>
+        </w:rPr>
+        <w:t xml:space="preserve">1.5a</w:t>
+      </w:r>
+      <w:r>
+        <w:t xml:space="preserve"> </w:t>
+      </w:r>
+      <w:r>
+        <w:t xml:space="preserve">— Report scaffold + persona / expected-result / coverage-polarity checks (the three highest-signal, purely-textual checks).</w:t>
+      </w:r>
+      <w:r>
+        <w:t xml:space="preserve"> </w:t>
+      </w:r>
+      <w:r>
+        <w:t xml:space="preserve">-</w:t>
+      </w:r>
+      <w:r>
+        <w:t xml:space="preserve"> </w:t>
+      </w:r>
+      <w:r>
+        <w:rPr>
+          <w:bCs/>
+          <w:b/>
+        </w:rPr>
+        <w:t xml:space="preserve">1.5b</w:t>
+      </w:r>
+      <w:r>
+        <w:t xml:space="preserve"> </w:t>
+      </w:r>
+      <w:r>
+        <w:t xml:space="preserve">— Test-data suitability + missing-preconditions + step-completeness checks.</w:t>
+      </w:r>
+      <w:r>
+        <w:t xml:space="preserve"> </w:t>
+      </w:r>
+      <w:r>
+        <w:t xml:space="preserve">-</w:t>
+      </w:r>
+      <w:r>
+        <w:t xml:space="preserve"> </w:t>
+      </w:r>
+      <w:r>
+        <w:rPr>
+          <w:bCs/>
+          <w:b/>
+        </w:rPr>
+        <w:t xml:space="preserve">1.5c</w:t>
+      </w:r>
+      <w:r>
+        <w:t xml:space="preserve"> </w:t>
+      </w:r>
+      <w:r>
+        <w:t xml:space="preserve">— Grounding-completeness check (confidence penalty, not a failure).</w:t>
+      </w:r>
+      <w:r>
+        <w:t xml:space="preserve"> </w:t>
+      </w:r>
+      <w:r>
+        <w:t xml:space="preserve">-</w:t>
+      </w:r>
+      <w:r>
+        <w:t xml:space="preserve"> </w:t>
+      </w:r>
+      <w:r>
+        <w:rPr>
+          <w:bCs/>
+          <w:b/>
+        </w:rPr>
+        <w:t xml:space="preserve">1.5d</w:t>
+      </w:r>
+      <w:r>
+        <w:t xml:space="preserve"> </w:t>
+      </w:r>
+      <w:r>
+        <w:t xml:space="preserve">— Automation Readiness Score aggregation + surface the report to the Script Composer and dashboard.</w:t>
+      </w:r>
+    </w:p>
+    <w:p>
+      <w:pPr>
+        <w:pStyle w:val="BlockText"/>
+      </w:pPr>
+      <w:r>
+        <w:rPr>
+          <w:bCs/>
+          <w:b/>
+        </w:rPr>
+        <w:t xml:space="preserve">Sequencing:</w:t>
+      </w:r>
+      <w:r>
+        <w:t xml:space="preserve"> </w:t>
+      </w:r>
+      <w:r>
+        <w:t xml:space="preserve">only after the Scenario Integrity Engine is stable do we begin Sprint 2.</w:t>
+      </w:r>
+    </w:p>
+    <w:p>
+      <w:r>
+        <w:pict>
+          <v:rect style="width:0;height:1.5pt" o:hralign="center" o:hrstd="t" o:hr="t"/>
+        </w:pict>
+      </w:r>
+    </w:p>
+    <w:bookmarkEnd w:id="32"/>
+    <w:bookmarkEnd w:id="33"/>
+    <w:bookmarkStart w:id="38" w:name="X9f34fcb1734506be7ac3d74ae2dafe6a5acd6ae"/>
+    <w:p>
+      <w:pPr>
+        <w:pStyle w:val="Heading3"/>
+      </w:pPr>
+      <w:r>
+        <w:t xml:space="preserve">Sprint 2 — Locator Ranking Engine ⭐⭐⭐⭐⭐ (highest ROI)</w:t>
+      </w:r>
+    </w:p>
+    <w:p>
+      <w:pPr>
+        <w:pStyle w:val="FirstParagraph"/>
+      </w:pPr>
+      <w:r>
+        <w:t xml:space="preserve">This is</w:t>
+      </w:r>
+      <w:r>
+        <w:t xml:space="preserve"> </w:t>
+      </w:r>
+      <w:r>
+        <w:rPr>
+          <w:bCs/>
+          <w:b/>
+        </w:rPr>
+        <w:t xml:space="preserve">not</w:t>
+      </w:r>
+      <w:r>
+        <w:t xml:space="preserve"> </w:t>
+      </w:r>
+      <w:r>
+        <w:t xml:space="preserve">“</w:t>
+      </w:r>
+      <w:r>
+        <w:t xml:space="preserve">better locators.</w:t>
+      </w:r>
+      <w:r>
+        <w:t xml:space="preserve">”</w:t>
+      </w:r>
+      <w:r>
+        <w:t xml:space="preserve"> </w:t>
+      </w:r>
+      <w:r>
+        <w:t xml:space="preserve">It is</w:t>
+      </w:r>
+      <w:r>
+        <w:t xml:space="preserve"> </w:t>
+      </w:r>
+      <w:r>
+        <w:rPr>
+          <w:bCs/>
+          <w:b/>
+        </w:rPr>
+        <w:t xml:space="preserve">better locator decision-making.</w:t>
+      </w:r>
+    </w:p>
+    <w:p>
+      <w:pPr>
+        <w:pStyle w:val="BodyText"/>
+      </w:pPr>
+      <w:r>
+        <w:rPr>
+          <w:bCs/>
+          <w:b/>
+        </w:rPr>
+        <w:t xml:space="preserve">Today</w:t>
+      </w:r>
+    </w:p>
+    <w:p>
+      <w:pPr>
+        <w:pStyle w:val="SourceCode"/>
+      </w:pPr>
+      <w:r>
+        <w:rPr>
+          <w:rStyle w:val="VerbatimChar"/>
+        </w:rPr>
+        <w:t xml:space="preserve">Grounding → Selector</w:t>
+      </w:r>
+    </w:p>
+    <w:p>
+      <w:pPr>
+        <w:pStyle w:val="FirstParagraph"/>
+      </w:pPr>
+      <w:r>
+        <w:rPr>
+          <w:bCs/>
+          <w:b/>
+        </w:rPr>
+        <w:t xml:space="preserve">Target</w:t>
+      </w:r>
+    </w:p>
+    <w:p>
+      <w:pPr>
+        <w:pStyle w:val="SourceCode"/>
+      </w:pPr>
+      <w:r>
+        <w:rPr>
+          <w:rStyle w:val="VerbatimChar"/>
+        </w:rPr>
+        <w:t xml:space="preserve">Grounding → Candidate Discovery → Candidate Ranking → Candidate Selection → Confidence</w:t>
+      </w:r>
+    </w:p>
+    <w:bookmarkStart w:id="34" w:name="Xa02d250f0771bf4568bfba6e027c46031cd190c"/>
+    <w:p>
+      <w:pPr>
+        <w:pStyle w:val="Heading4"/>
+      </w:pPr>
+      <w:r>
+        <w:t xml:space="preserve">4.1 Candidate Discovery — collect, do not select</w:t>
+      </w:r>
+    </w:p>
+    <w:p>
+      <w:pPr>
+        <w:pStyle w:val="FirstParagraph"/>
+      </w:pPr>
+      <w:r>
+        <w:t xml:space="preserve">Gather candidates from every source, in priority order.</w:t>
+      </w:r>
+      <w:r>
+        <w:t xml:space="preserve"> </w:t>
+      </w:r>
+      <w:r>
+        <w:rPr>
+          <w:bCs/>
+          <w:b/>
+        </w:rPr>
+        <w:t xml:space="preserve">Do not choose yet.</w:t>
+      </w:r>
+    </w:p>
+    <w:p>
+      <w:pPr>
+        <w:numPr>
+          <w:ilvl w:val="0"/>
+          <w:numId w:val="1012"/>
+        </w:numPr>
+        <w:pStyle w:val="Compact"/>
+      </w:pPr>
+      <w:r>
+        <w:t xml:space="preserve">Existing</w:t>
+      </w:r>
+      <w:r>
+        <w:t xml:space="preserve"> </w:t>
+      </w:r>
+      <w:r>
+        <w:rPr>
+          <w:bCs/>
+          <w:b/>
+        </w:rPr>
+        <w:t xml:space="preserve">Page Object</w:t>
+      </w:r>
+      <w:r>
+        <w:t xml:space="preserve"> </w:t>
+      </w:r>
+      <w:r>
+        <w:t xml:space="preserve">methods (reuse wins)</w:t>
+      </w:r>
+    </w:p>
+    <w:p>
+      <w:pPr>
+        <w:numPr>
+          <w:ilvl w:val="0"/>
+          <w:numId w:val="1012"/>
+        </w:numPr>
+        <w:pStyle w:val="Compact"/>
+      </w:pPr>
+      <w:r>
+        <w:rPr>
+          <w:bCs/>
+          <w:b/>
+        </w:rPr>
+        <w:t xml:space="preserve">App Profile</w:t>
+      </w:r>
+      <w:r>
+        <w:t xml:space="preserve"> </w:t>
+      </w:r>
+      <w:r>
+        <w:t xml:space="preserve">(crawled grounding)</w:t>
+      </w:r>
+    </w:p>
+    <w:p>
+      <w:pPr>
+        <w:numPr>
+          <w:ilvl w:val="0"/>
+          <w:numId w:val="1012"/>
+        </w:numPr>
+        <w:pStyle w:val="Compact"/>
+      </w:pPr>
+      <w:r>
+        <w:rPr>
+          <w:bCs/>
+          <w:b/>
+        </w:rPr>
+        <w:t xml:space="preserve">Test Case</w:t>
+      </w:r>
+      <w:r>
+        <w:t xml:space="preserve"> </w:t>
+      </w:r>
+      <w:r>
+        <w:t xml:space="preserve">wording</w:t>
+      </w:r>
+    </w:p>
+    <w:p>
+      <w:pPr>
+        <w:numPr>
+          <w:ilvl w:val="0"/>
+          <w:numId w:val="1012"/>
+        </w:numPr>
+        <w:pStyle w:val="Compact"/>
+      </w:pPr>
+      <w:r>
+        <w:rPr>
+          <w:bCs/>
+          <w:b/>
+        </w:rPr>
+        <w:t xml:space="preserve">Expected Result</w:t>
+      </w:r>
+      <w:r>
+        <w:t xml:space="preserve"> </w:t>
+      </w:r>
+      <w:r>
+        <w:t xml:space="preserve">text</w:t>
+      </w:r>
+    </w:p>
+    <w:p>
+      <w:pPr>
+        <w:numPr>
+          <w:ilvl w:val="0"/>
+          <w:numId w:val="1012"/>
+        </w:numPr>
+        <w:pStyle w:val="Compact"/>
+      </w:pPr>
+      <w:r>
+        <w:rPr>
+          <w:bCs/>
+          <w:b/>
+        </w:rPr>
+        <w:t xml:space="preserve">Requirement</w:t>
+      </w:r>
+      <w:r>
+        <w:t xml:space="preserve"> </w:t>
+      </w:r>
+      <w:r>
+        <w:t xml:space="preserve">text</w:t>
+      </w:r>
+    </w:p>
+    <w:p>
+      <w:pPr>
+        <w:numPr>
+          <w:ilvl w:val="0"/>
+          <w:numId w:val="1012"/>
+        </w:numPr>
+        <w:pStyle w:val="Compact"/>
+      </w:pPr>
+      <w:r>
+        <w:rPr>
+          <w:bCs/>
+          <w:b/>
+        </w:rPr>
+        <w:t xml:space="preserve">DOM</w:t>
+      </w:r>
+      <w:r>
+        <w:t xml:space="preserve"> </w:t>
+      </w:r>
+      <w:r>
+        <w:t xml:space="preserve">relationships</w:t>
+      </w:r>
+    </w:p>
+    <w:p>
+      <w:pPr>
+        <w:numPr>
+          <w:ilvl w:val="0"/>
+          <w:numId w:val="1012"/>
+        </w:numPr>
+        <w:pStyle w:val="Compact"/>
+      </w:pPr>
+      <w:r>
+        <w:rPr>
+          <w:bCs/>
+          <w:b/>
+        </w:rPr>
+        <w:t xml:space="preserve">Accessibility</w:t>
+      </w:r>
+      <w:r>
+        <w:t xml:space="preserve"> </w:t>
+      </w:r>
+      <w:r>
+        <w:t xml:space="preserve">(role + name, aria-label, label association)</w:t>
+      </w:r>
+    </w:p>
+    <w:p>
+      <w:pPr>
+        <w:numPr>
+          <w:ilvl w:val="0"/>
+          <w:numId w:val="1012"/>
+        </w:numPr>
+        <w:pStyle w:val="Compact"/>
+      </w:pPr>
+      <w:r>
+        <w:rPr>
+          <w:bCs/>
+          <w:b/>
+        </w:rPr>
+        <w:t xml:space="preserve">AI</w:t>
+      </w:r>
+      <w:r>
+        <w:t xml:space="preserve"> </w:t>
+      </w:r>
+      <w:r>
+        <w:t xml:space="preserve">— last resort only</w:t>
+      </w:r>
+    </w:p>
+    <w:p>
+      <w:pPr>
+        <w:pStyle w:val="BlockText"/>
+      </w:pPr>
+      <w:r>
+        <w:rPr>
+          <w:bCs/>
+          <w:b/>
+        </w:rPr>
+        <w:t xml:space="preserve">Fallback search chain before AI.</w:t>
+      </w:r>
+      <w:r>
+        <w:t xml:space="preserve"> </w:t>
+      </w:r>
+      <w:r>
+        <w:t xml:space="preserve">When the App Profile misses an element, do</w:t>
+      </w:r>
+      <w:r>
+        <w:t xml:space="preserve"> </w:t>
+      </w:r>
+      <w:r>
+        <w:rPr>
+          <w:bCs/>
+          <w:b/>
+        </w:rPr>
+        <w:t xml:space="preserve">not</w:t>
+      </w:r>
+      <w:r>
+        <w:t xml:space="preserve"> </w:t>
+      </w:r>
+      <w:r>
+        <w:t xml:space="preserve">jump to</w:t>
+      </w:r>
+      <w:r>
+        <w:t xml:space="preserve"> </w:t>
+      </w:r>
+      <w:r>
+        <w:t xml:space="preserve">the LLM. Search deterministically first:</w:t>
+      </w:r>
+    </w:p>
+    <w:p>
+      <w:pPr>
+        <w:pStyle w:val="SourceCode"/>
+      </w:pPr>
+      <w:r>
+        <w:rPr>
+          <w:rStyle w:val="VerbatimChar"/>
+        </w:rPr>
+        <w:t xml:space="preserve">Test Case → Keywords → Expected Result → Requirement → Page Object → DOM → AI</w:t>
+      </w:r>
+    </w:p>
+    <w:p>
+      <w:pPr>
+        <w:pStyle w:val="BlockText"/>
+      </w:pPr>
+      <w:r>
+        <w:t xml:space="preserve">Example — manual step</w:t>
+      </w:r>
+      <w:r>
+        <w:t xml:space="preserve"> </w:t>
+      </w:r>
+      <w:r>
+        <w:rPr>
+          <w:rStyle w:val="VerbatimChar"/>
+        </w:rPr>
+        <w:t xml:space="preserve">Click Login</w:t>
+      </w:r>
+      <w:r>
+        <w:t xml:space="preserve">, expected</w:t>
+      </w:r>
+      <w:r>
+        <w:t xml:space="preserve"> </w:t>
+      </w:r>
+      <w:r>
+        <w:rPr>
+          <w:rStyle w:val="VerbatimChar"/>
+        </w:rPr>
+        <w:t xml:space="preserve">Dashboard appears</w:t>
+      </w:r>
+      <w:r>
+        <w:t xml:space="preserve">: the composer infers Login</w:t>
+      </w:r>
+      <w:r>
+        <w:t xml:space="preserve"> </w:t>
+      </w:r>
+      <w:r>
+        <w:t xml:space="preserve">causes navigation and searches for</w:t>
+      </w:r>
+      <w:r>
+        <w:t xml:space="preserve"> </w:t>
+      </w:r>
+      <w:r>
+        <w:rPr>
+          <w:rStyle w:val="VerbatimChar"/>
+        </w:rPr>
+        <w:t xml:space="preserve">login / sign in / submit / authenticate</w:t>
+      </w:r>
+      <w:r>
+        <w:t xml:space="preserve"> </w:t>
+      </w:r>
+      <w:r>
+        <w:t xml:space="preserve">candidates instead</w:t>
+      </w:r>
+      <w:r>
+        <w:t xml:space="preserve"> </w:t>
+      </w:r>
+      <w:r>
+        <w:t xml:space="preserve">of hallucinating a selector.</w:t>
+      </w:r>
+    </w:p>
+    <w:bookmarkEnd w:id="34"/>
+    <w:bookmarkStart w:id="35" w:name="candidate-ranking-score-every-candidate"/>
+    <w:p>
+      <w:pPr>
+        <w:pStyle w:val="Heading4"/>
+      </w:pPr>
+      <w:r>
+        <w:t xml:space="preserve">4.2 Candidate Ranking — score every candidate</w:t>
+      </w:r>
+    </w:p>
+    <w:p>
+      <w:pPr>
+        <w:pStyle w:val="FirstParagraph"/>
+      </w:pPr>
+      <w:r>
+        <w:t xml:space="preserve">Reuse/extend</w:t>
+      </w:r>
+      <w:r>
+        <w:t xml:space="preserve"> </w:t>
+      </w:r>
+      <w:r>
+        <w:rPr>
+          <w:rStyle w:val="VerbatimChar"/>
+        </w:rPr>
+        <w:t xml:space="preserve">core/candidate-ranker.ts</w:t>
+      </w:r>
+      <w:r>
+        <w:t xml:space="preserve"> </w:t>
+      </w:r>
+      <w:r>
+        <w:t xml:space="preserve">scoring. Indicative scores:</w:t>
+      </w:r>
+    </w:p>
+    <w:tbl>
+      <w:tblPr>
+        <w:tblStyle w:val="Table"/>
+        <w:tblW w:type="auto" w:w="0"/>
+        <w:tblLook w:firstRow="1" w:lastRow="0" w:firstColumn="0" w:lastColumn="0" w:noHBand="0" w:noVBand="0" w:val="0020"/>
+      </w:tblPr>
+      <w:tblGrid>
+        <w:gridCol w:w="3960"/>
+        <w:gridCol w:w="3960"/>
+      </w:tblGrid>
+      <w:tr>
+        <w:trPr>
+          <w:tblHeader w:val="true"/>
+        </w:trPr>
+        <w:tc>
+          <w:tcPr/>
+          <w:p>
+            <w:pPr>
+              <w:pStyle w:val="Compact"/>
+              <w:jc w:val="left"/>
+            </w:pPr>
+            <w:r>
               <w:t xml:space="preserve">Source / strategy</w:t>
             </w:r>
           </w:p>
@@ -2526,8 +3821,8 @@
         <w:t xml:space="preserve">Never just use the first locator. Find → Rank → Choose.</w:t>
       </w:r>
     </w:p>
-    <w:bookmarkEnd w:id="30"/>
-    <w:bookmarkStart w:id="31" w:name="candidate-selection"/>
+    <w:bookmarkEnd w:id="35"/>
+    <w:bookmarkStart w:id="36" w:name="candidate-selection"/>
     <w:p>
       <w:pPr>
         <w:pStyle w:val="Heading4"/>
@@ -2540,7 +3835,7 @@
       <w:pPr>
         <w:numPr>
           <w:ilvl w:val="0"/>
-          <w:numId w:val="1005"/>
+          <w:numId w:val="1013"/>
         </w:numPr>
       </w:pPr>
       <w:r>
@@ -2551,7 +3846,7 @@
       <w:pPr>
         <w:numPr>
           <w:ilvl w:val="0"/>
-          <w:numId w:val="1005"/>
+          <w:numId w:val="1013"/>
         </w:numPr>
       </w:pPr>
       <w:r>
@@ -2598,8 +3893,8 @@
         <w:t xml:space="preserve">Alternative: getByTestId('login-btn')</w:t>
       </w:r>
     </w:p>
-    <w:bookmarkEnd w:id="31"/>
-    <w:bookmarkStart w:id="32" w:name="confidence-banding-feeds-sprint-7"/>
+    <w:bookmarkEnd w:id="36"/>
+    <w:bookmarkStart w:id="37" w:name="confidence-banding-feeds-sprint-7"/>
     <w:p>
       <w:pPr>
         <w:pStyle w:val="Heading4"/>
@@ -2907,9 +4202,9 @@
         </w:pict>
       </w:r>
     </w:p>
-    <w:bookmarkEnd w:id="32"/>
-    <w:bookmarkEnd w:id="33"/>
-    <w:bookmarkStart w:id="34" w:name="sprint-3-assertion-expansion"/>
+    <w:bookmarkEnd w:id="37"/>
+    <w:bookmarkEnd w:id="38"/>
+    <w:bookmarkStart w:id="39" w:name="sprint-3-assertion-expansion"/>
     <w:p>
       <w:pPr>
         <w:pStyle w:val="Heading3"/>
@@ -3122,8 +4417,8 @@
         </w:pict>
       </w:r>
     </w:p>
-    <w:bookmarkEnd w:id="34"/>
-    <w:bookmarkStart w:id="35" w:name="sprint-4-coverage-expansion"/>
+    <w:bookmarkEnd w:id="39"/>
+    <w:bookmarkStart w:id="40" w:name="sprint-4-coverage-expansion"/>
     <w:p>
       <w:pPr>
         <w:pStyle w:val="Heading3"/>
@@ -3191,7 +4486,7 @@
       <w:pPr>
         <w:numPr>
           <w:ilvl w:val="0"/>
-          <w:numId w:val="1006"/>
+          <w:numId w:val="1014"/>
         </w:numPr>
         <w:pStyle w:val="Compact"/>
       </w:pPr>
@@ -3203,7 +4498,7 @@
       <w:pPr>
         <w:numPr>
           <w:ilvl w:val="0"/>
-          <w:numId w:val="1006"/>
+          <w:numId w:val="1014"/>
         </w:numPr>
         <w:pStyle w:val="Compact"/>
       </w:pPr>
@@ -3215,7 +4510,7 @@
       <w:pPr>
         <w:numPr>
           <w:ilvl w:val="0"/>
-          <w:numId w:val="1006"/>
+          <w:numId w:val="1014"/>
         </w:numPr>
         <w:pStyle w:val="Compact"/>
       </w:pPr>
@@ -3227,7 +4522,7 @@
       <w:pPr>
         <w:numPr>
           <w:ilvl w:val="0"/>
-          <w:numId w:val="1006"/>
+          <w:numId w:val="1014"/>
         </w:numPr>
         <w:pStyle w:val="Compact"/>
       </w:pPr>
@@ -3239,7 +4534,7 @@
       <w:pPr>
         <w:numPr>
           <w:ilvl w:val="0"/>
-          <w:numId w:val="1006"/>
+          <w:numId w:val="1014"/>
         </w:numPr>
         <w:pStyle w:val="Compact"/>
       </w:pPr>
@@ -3278,8 +4573,8 @@
         </w:pict>
       </w:r>
     </w:p>
-    <w:bookmarkEnd w:id="35"/>
-    <w:bookmarkStart w:id="36" w:name="sprint-5-framework-reuse"/>
+    <w:bookmarkEnd w:id="40"/>
+    <w:bookmarkStart w:id="41" w:name="sprint-5-framework-reuse"/>
     <w:p>
       <w:pPr>
         <w:pStyle w:val="Heading3"/>
@@ -3422,8 +4717,8 @@
         </w:pict>
       </w:r>
     </w:p>
-    <w:bookmarkEnd w:id="36"/>
-    <w:bookmarkStart w:id="37" w:name="sprint-6-humanization"/>
+    <w:bookmarkEnd w:id="41"/>
+    <w:bookmarkStart w:id="42" w:name="sprint-6-humanization"/>
     <w:p>
       <w:pPr>
         <w:pStyle w:val="Heading3"/>
@@ -3517,7 +4812,7 @@
       <w:pPr>
         <w:numPr>
           <w:ilvl w:val="0"/>
-          <w:numId w:val="1007"/>
+          <w:numId w:val="1015"/>
         </w:numPr>
         <w:pStyle w:val="Compact"/>
       </w:pPr>
@@ -3529,7 +4824,7 @@
       <w:pPr>
         <w:numPr>
           <w:ilvl w:val="0"/>
-          <w:numId w:val="1007"/>
+          <w:numId w:val="1015"/>
         </w:numPr>
         <w:pStyle w:val="Compact"/>
       </w:pPr>
@@ -3541,7 +4836,7 @@
       <w:pPr>
         <w:numPr>
           <w:ilvl w:val="0"/>
-          <w:numId w:val="1007"/>
+          <w:numId w:val="1015"/>
         </w:numPr>
         <w:pStyle w:val="Compact"/>
       </w:pPr>
@@ -3553,7 +4848,7 @@
       <w:pPr>
         <w:numPr>
           <w:ilvl w:val="0"/>
-          <w:numId w:val="1007"/>
+          <w:numId w:val="1015"/>
         </w:numPr>
         <w:pStyle w:val="Compact"/>
       </w:pPr>
@@ -3565,7 +4860,7 @@
       <w:pPr>
         <w:numPr>
           <w:ilvl w:val="0"/>
-          <w:numId w:val="1007"/>
+          <w:numId w:val="1015"/>
         </w:numPr>
         <w:pStyle w:val="Compact"/>
       </w:pPr>
@@ -3588,8 +4883,8 @@
         </w:pict>
       </w:r>
     </w:p>
-    <w:bookmarkEnd w:id="37"/>
-    <w:bookmarkStart w:id="39" w:name="sprint-7-confidence-engine"/>
+    <w:bookmarkEnd w:id="42"/>
+    <w:bookmarkStart w:id="44" w:name="sprint-7-confidence-engine"/>
     <w:p>
       <w:pPr>
         <w:pStyle w:val="Heading3"/>
@@ -3694,7 +4989,7 @@
         <w:t xml:space="preserve">, don’t guess.</w:t>
       </w:r>
     </w:p>
-    <w:bookmarkStart w:id="38" w:name="smart-todos-not-ai-noise"/>
+    <w:bookmarkStart w:id="43" w:name="smart-todos-not-ai-noise"/>
     <w:p>
       <w:pPr>
         <w:pStyle w:val="Heading4"/>
@@ -3784,16 +5079,16 @@
         </w:pict>
       </w:r>
     </w:p>
-    <w:bookmarkEnd w:id="38"/>
-    <w:bookmarkEnd w:id="39"/>
-    <w:bookmarkEnd w:id="40"/>
-    <w:bookmarkStart w:id="42" w:name="Xbaf57dc3be63dc84be70092ed21ae4b7f4b192d"/>
+    <w:bookmarkEnd w:id="43"/>
+    <w:bookmarkEnd w:id="44"/>
+    <w:bookmarkEnd w:id="45"/>
+    <w:bookmarkStart w:id="48" w:name="Xd6ef9168f7d25886bb72671593bdfc53ba2d290"/>
     <w:p>
       <w:pPr>
         <w:pStyle w:val="Heading2"/>
       </w:pPr>
       <w:r>
-        <w:t xml:space="preserve">5. The Engineering Heuristics Library (the secret sauce)</w:t>
+        <w:t xml:space="preserve">5. The two deterministic rule libraries (the secret sauce)</w:t>
       </w:r>
     </w:p>
     <w:p>
@@ -3801,357 +5096,29 @@
         <w:pStyle w:val="FirstParagraph"/>
       </w:pPr>
       <w:r>
-        <w:t xml:space="preserve">Not another intelligence. A</w:t>
-      </w:r>
-      <w:r>
-        <w:t xml:space="preserve"> </w:t>
-      </w:r>
-      <w:r>
-        <w:rPr>
-          <w:bCs/>
-          <w:b/>
-        </w:rPr>
-        <w:t xml:space="preserve">deterministic rule library</w:t>
-      </w:r>
-      <w:r>
-        <w:t xml:space="preserve"> </w:t>
-      </w:r>
-      <w:r>
-        <w:t xml:space="preserve">that captures how experienced automation</w:t>
-      </w:r>
-      <w:r>
-        <w:t xml:space="preserve"> </w:t>
-      </w:r>
-      <w:r>
-        <w:t xml:space="preserve">engineers think. Every generation consults it.</w:t>
-      </w:r>
-      <w:r>
-        <w:t xml:space="preserve"> </w:t>
-      </w:r>
-      <w:r>
-        <w:rPr>
-          <w:bCs/>
-          <w:b/>
-        </w:rPr>
-        <w:t xml:space="preserve">No LLM. No prompt. No tokens.</w:t>
-      </w:r>
-      <w:r>
-        <w:t xml:space="preserve"> </w:t>
-      </w:r>
-      <w:r>
-        <w:t xml:space="preserve">It improves the</w:t>
-      </w:r>
-      <w:r>
-        <w:t xml:space="preserve"> </w:t>
-      </w:r>
-      <w:r>
-        <w:t xml:space="preserve">product over time without growing prompt size.</w:t>
-      </w:r>
-    </w:p>
-    <w:p>
-      <w:pPr>
-        <w:pStyle w:val="BodyText"/>
-      </w:pPr>
-      <w:r>
-        <w:rPr>
-          <w:bCs/>
-          <w:b/>
-        </w:rPr>
-        <w:t xml:space="preserve">Proposed home:</w:t>
-      </w:r>
-      <w:r>
-        <w:t xml:space="preserve"> </w:t>
-      </w:r>
-      <w:r>
-        <w:rPr>
-          <w:rStyle w:val="VerbatimChar"/>
-        </w:rPr>
-        <w:t xml:space="preserve">src/script-gen/heuristics/</w:t>
-      </w:r>
-      <w:r>
-        <w:t xml:space="preserve"> </w:t>
-      </w:r>
-      <w:r>
-        <w:t xml:space="preserve">(a pure, dependency-light rule module consumed by</w:t>
-      </w:r>
-      <w:r>
-        <w:t xml:space="preserve"> </w:t>
-      </w:r>
-      <w:r>
-        <w:rPr>
-          <w:rStyle w:val="VerbatimChar"/>
-        </w:rPr>
-        <w:t xml:space="preserve">ScriptGenEngine</w:t>
-      </w:r>
-      <w:r>
-        <w:t xml:space="preserve">). Rules are data + pure functions — unit-tested and versioned.</w:t>
-      </w:r>
-    </w:p>
-    <w:bookmarkStart w:id="41" w:name="rule-families"/>
-    <w:p>
-      <w:pPr>
-        <w:pStyle w:val="Heading3"/>
-      </w:pPr>
-      <w:r>
-        <w:t xml:space="preserve">Rule families</w:t>
-      </w:r>
-    </w:p>
-    <w:p>
-      <w:pPr>
-        <w:pStyle w:val="FirstParagraph"/>
-      </w:pPr>
-      <w:r>
-        <w:rPr>
-          <w:bCs/>
-          <w:b/>
-        </w:rPr>
-        <w:t xml:space="preserve">Locator heuristics</w:t>
-      </w:r>
-      <w:r>
-        <w:t xml:space="preserve"> </w:t>
-      </w:r>
-      <w:r>
-        <w:t xml:space="preserve">- Prefer existing page-object methods.</w:t>
-      </w:r>
-      <w:r>
-        <w:t xml:space="preserve"> </w:t>
-      </w:r>
-      <w:r>
-        <w:t xml:space="preserve">- Prefer</w:t>
-      </w:r>
-      <w:r>
-        <w:t xml:space="preserve"> </w:t>
-      </w:r>
-      <w:r>
-        <w:rPr>
-          <w:rStyle w:val="VerbatimChar"/>
-        </w:rPr>
-        <w:t xml:space="preserve">data-testid</w:t>
-      </w:r>
-      <w:r>
-        <w:t xml:space="preserve">.</w:t>
-      </w:r>
-      <w:r>
-        <w:t xml:space="preserve"> </w:t>
-      </w:r>
-      <w:r>
-        <w:t xml:space="preserve">- Prefer accessible roles and names.</w:t>
-      </w:r>
-      <w:r>
-        <w:t xml:space="preserve"> </w:t>
-      </w:r>
-      <w:r>
-        <w:t xml:space="preserve">- Avoid brittle CSS / XPath unless necessary.</w:t>
-      </w:r>
-    </w:p>
-    <w:p>
-      <w:pPr>
-        <w:pStyle w:val="BodyText"/>
-      </w:pPr>
-      <w:r>
-        <w:rPr>
-          <w:bCs/>
-          <w:b/>
-        </w:rPr>
-        <w:t xml:space="preserve">Assertion heuristics</w:t>
-      </w:r>
-      <w:r>
-        <w:t xml:space="preserve"> </w:t>
-      </w:r>
-      <w:r>
-        <w:t xml:space="preserve">- Verify business outcome first.</w:t>
-      </w:r>
-      <w:r>
-        <w:t xml:space="preserve"> </w:t>
-      </w:r>
-      <w:r>
-        <w:t xml:space="preserve">- Add one or two stability assertions.</w:t>
-      </w:r>
-      <w:r>
-        <w:t xml:space="preserve"> </w:t>
-      </w:r>
-      <w:r>
-        <w:t xml:space="preserve">- Don’t generate redundant assertions.</w:t>
-      </w:r>
-    </w:p>
-    <w:p>
-      <w:pPr>
-        <w:pStyle w:val="BodyText"/>
-      </w:pPr>
-      <w:r>
-        <w:rPr>
-          <w:bCs/>
-          <w:b/>
-        </w:rPr>
-        <w:t xml:space="preserve">Framework heuristics</w:t>
-      </w:r>
-      <w:r>
-        <w:t xml:space="preserve"> </w:t>
-      </w:r>
-      <w:r>
-        <w:t xml:space="preserve">- Reuse existing fixtures.</w:t>
-      </w:r>
-      <w:r>
-        <w:t xml:space="preserve"> </w:t>
-      </w:r>
-      <w:r>
-        <w:t xml:space="preserve">- Reuse page-object methods.</w:t>
-      </w:r>
-      <w:r>
-        <w:t xml:space="preserve"> </w:t>
-      </w:r>
-      <w:r>
-        <w:t xml:space="preserve">- Don’t create duplicate utilities.</w:t>
-      </w:r>
-    </w:p>
-    <w:p>
-      <w:pPr>
-        <w:pStyle w:val="BodyText"/>
-      </w:pPr>
-      <w:r>
-        <w:rPr>
-          <w:bCs/>
-          <w:b/>
-        </w:rPr>
-        <w:t xml:space="preserve">Naming heuristics</w:t>
-      </w:r>
-      <w:r>
-        <w:t xml:space="preserve"> </w:t>
-      </w:r>
-      <w:r>
-        <w:t xml:space="preserve">- Follow the project’s existing naming conventions.</w:t>
-      </w:r>
-      <w:r>
-        <w:t xml:space="preserve"> </w:t>
-      </w:r>
-      <w:r>
-        <w:t xml:space="preserve">- Avoid identical/templated names everywhere.</w:t>
-      </w:r>
-    </w:p>
-    <w:p>
-      <w:pPr>
-        <w:pStyle w:val="BodyText"/>
-      </w:pPr>
-      <w:r>
-        <w:rPr>
-          <w:bCs/>
-          <w:b/>
-        </w:rPr>
-        <w:t xml:space="preserve">Playwright heuristics</w:t>
-      </w:r>
-      <w:r>
-        <w:t xml:space="preserve"> </w:t>
-      </w:r>
-      <w:r>
-        <w:t xml:space="preserve">- No</w:t>
-      </w:r>
-      <w:r>
-        <w:t xml:space="preserve"> </w:t>
-      </w:r>
-      <w:r>
-        <w:rPr>
-          <w:rStyle w:val="VerbatimChar"/>
-        </w:rPr>
-        <w:t xml:space="preserve">waitForTimeout</w:t>
-      </w:r>
-      <w:r>
-        <w:t xml:space="preserve">; use web-first assertions and auto-waiting.</w:t>
-      </w:r>
-      <w:r>
-        <w:t xml:space="preserve"> </w:t>
-      </w:r>
-      <w:r>
-        <w:t xml:space="preserve">- Prefer user-facing locators (</w:t>
-      </w:r>
-      <w:r>
-        <w:rPr>
-          <w:rStyle w:val="VerbatimChar"/>
-        </w:rPr>
-        <w:t xml:space="preserve">getByRole</w:t>
-      </w:r>
-      <w:r>
-        <w:t xml:space="preserve"> </w:t>
-      </w:r>
-      <w:r>
-        <w:t xml:space="preserve">/</w:t>
-      </w:r>
-      <w:r>
-        <w:t xml:space="preserve"> </w:t>
-      </w:r>
-      <w:r>
-        <w:rPr>
-          <w:rStyle w:val="VerbatimChar"/>
-        </w:rPr>
-        <w:t xml:space="preserve">getByLabel</w:t>
-      </w:r>
-      <w:r>
-        <w:t xml:space="preserve">).</w:t>
-      </w:r>
-    </w:p>
-    <w:p>
-      <w:pPr>
-        <w:pStyle w:val="BodyText"/>
-      </w:pPr>
-      <w:r>
-        <w:t xml:space="preserve">These heuristics evolve over time (Sprint 7+</w:t>
-      </w:r>
-      <w:r>
-        <w:t xml:space="preserve"> </w:t>
-      </w:r>
-      <w:r>
-        <w:t xml:space="preserve">“</w:t>
-      </w:r>
-      <w:r>
-        <w:t xml:space="preserve">continuous learning</w:t>
-      </w:r>
-      <w:r>
-        <w:t xml:space="preserve">”</w:t>
-      </w:r>
-      <w:r>
-        <w:t xml:space="preserve"> </w:t>
-      </w:r>
-      <w:r>
-        <w:t xml:space="preserve">improves the weights from</w:t>
-      </w:r>
-      <w:r>
-        <w:t xml:space="preserve"> </w:t>
-      </w:r>
-      <w:r>
-        <w:t xml:space="preserve">successful generations) —</w:t>
-      </w:r>
-      <w:r>
-        <w:t xml:space="preserve"> </w:t>
-      </w:r>
-      <w:r>
-        <w:rPr>
-          <w:bCs/>
-          <w:b/>
-        </w:rPr>
-        <w:t xml:space="preserve">without</w:t>
-      </w:r>
-      <w:r>
-        <w:t xml:space="preserve"> </w:t>
-      </w:r>
-      <w:r>
-        <w:t xml:space="preserve">increasing token usage or architectural complexity.</w:t>
-      </w:r>
-    </w:p>
-    <w:p>
-      <w:r>
-        <w:pict>
-          <v:rect style="width:0;height:1.5pt" o:hralign="center" o:hrstd="t" o:hr="t"/>
-        </w:pict>
-      </w:r>
-    </w:p>
-    <w:bookmarkEnd w:id="41"/>
-    <w:bookmarkEnd w:id="42"/>
-    <w:bookmarkStart w:id="43" w:name="long-term-stable-roadmap"/>
-    <w:p>
-      <w:pPr>
-        <w:pStyle w:val="Heading2"/>
-      </w:pPr>
-      <w:r>
-        <w:t xml:space="preserve">6. Long-term stable roadmap</w:t>
+        <w:t xml:space="preserve">The system will have</w:t>
+      </w:r>
+      <w:r>
+        <w:t xml:space="preserve"> </w:t>
+      </w:r>
+      <w:r>
+        <w:rPr>
+          <w:bCs/>
+          <w:b/>
+        </w:rPr>
+        <w:t xml:space="preserve">exactly two</w:t>
+      </w:r>
+      <w:r>
+        <w:t xml:space="preserve"> </w:t>
+      </w:r>
+      <w:r>
+        <w:t xml:space="preserve">deterministic rule libraries — and no third intelligence layer.</w:t>
+      </w:r>
+      <w:r>
+        <w:t xml:space="preserve"> </w:t>
+      </w:r>
+      <w:r>
+        <w:t xml:space="preserve">They complement each other without adding an AI component or growing prompts:</w:t>
       </w:r>
     </w:p>
     <w:tbl>
@@ -4177,31 +5144,31 @@
               <w:jc w:val="left"/>
             </w:pPr>
             <w:r>
-              <w:t xml:space="preserve">Phase</w:t>
-            </w:r>
-          </w:p>
-        </w:tc>
-        <w:tc>
-          <w:tcPr/>
-          <w:p>
-            <w:pPr>
-              <w:pStyle w:val="Compact"/>
-              <w:jc w:val="left"/>
-            </w:pPr>
-            <w:r>
-              <w:t xml:space="preserve">Goal</w:t>
-            </w:r>
-          </w:p>
-        </w:tc>
-        <w:tc>
-          <w:tcPr/>
-          <w:p>
-            <w:pPr>
-              <w:pStyle w:val="Compact"/>
-              <w:jc w:val="left"/>
-            </w:pPr>
-            <w:r>
-              <w:t xml:space="preserve">Change type</w:t>
+              <w:t xml:space="preserve">Library</w:t>
+            </w:r>
+          </w:p>
+        </w:tc>
+        <w:tc>
+          <w:tcPr/>
+          <w:p>
+            <w:pPr>
+              <w:pStyle w:val="Compact"/>
+              <w:jc w:val="left"/>
+            </w:pPr>
+            <w:r>
+              <w:t xml:space="preserve">Question it answers</w:t>
+            </w:r>
+          </w:p>
+        </w:tc>
+        <w:tc>
+          <w:tcPr/>
+          <w:p>
+            <w:pPr>
+              <w:pStyle w:val="Compact"/>
+              <w:jc w:val="left"/>
+            </w:pPr>
+            <w:r>
+              <w:t xml:space="preserve">Stage</w:t>
             </w:r>
           </w:p>
         </w:tc>
@@ -4215,6 +5182,608 @@
               <w:jc w:val="left"/>
             </w:pPr>
             <w:r>
+              <w:rPr>
+                <w:bCs/>
+                <w:b/>
+              </w:rPr>
+              <w:t xml:space="preserve">Scenario Integrity Engine</w:t>
+            </w:r>
+            <w:r>
+              <w:t xml:space="preserve"> </w:t>
+            </w:r>
+            <w:r>
+              <w:t xml:space="preserve">(§4, Sprint 1.5)</w:t>
+            </w:r>
+          </w:p>
+        </w:tc>
+        <w:tc>
+          <w:tcPr/>
+          <w:p>
+            <w:pPr>
+              <w:pStyle w:val="Compact"/>
+              <w:jc w:val="left"/>
+            </w:pPr>
+            <w:r>
+              <w:rPr>
+                <w:iCs/>
+                <w:i/>
+              </w:rPr>
+              <w:t xml:space="preserve">“</w:t>
+            </w:r>
+            <w:r>
+              <w:rPr>
+                <w:iCs/>
+                <w:i/>
+              </w:rPr>
+              <w:t xml:space="preserve">Is the canonical scenario internally correct and automation-ready?</w:t>
+            </w:r>
+            <w:r>
+              <w:rPr>
+                <w:iCs/>
+                <w:i/>
+              </w:rPr>
+              <w:t xml:space="preserve">”</w:t>
+            </w:r>
+          </w:p>
+        </w:tc>
+        <w:tc>
+          <w:tcPr/>
+          <w:p>
+            <w:pPr>
+              <w:pStyle w:val="Compact"/>
+              <w:jc w:val="left"/>
+            </w:pPr>
+            <w:r>
+              <w:t xml:space="preserve">Before the Composer</w:t>
+            </w:r>
+          </w:p>
+        </w:tc>
+      </w:tr>
+      <w:tr>
+        <w:tc>
+          <w:tcPr/>
+          <w:p>
+            <w:pPr>
+              <w:pStyle w:val="Compact"/>
+              <w:jc w:val="left"/>
+            </w:pPr>
+            <w:r>
+              <w:rPr>
+                <w:bCs/>
+                <w:b/>
+              </w:rPr>
+              <w:t xml:space="preserve">Engineering Heuristics Library</w:t>
+            </w:r>
+            <w:r>
+              <w:t xml:space="preserve"> </w:t>
+            </w:r>
+            <w:r>
+              <w:t xml:space="preserve">(below)</w:t>
+            </w:r>
+          </w:p>
+        </w:tc>
+        <w:tc>
+          <w:tcPr/>
+          <w:p>
+            <w:pPr>
+              <w:pStyle w:val="Compact"/>
+              <w:jc w:val="left"/>
+            </w:pPr>
+            <w:r>
+              <w:rPr>
+                <w:iCs/>
+                <w:i/>
+              </w:rPr>
+              <w:t xml:space="preserve">“</w:t>
+            </w:r>
+            <w:r>
+              <w:rPr>
+                <w:iCs/>
+                <w:i/>
+              </w:rPr>
+              <w:t xml:space="preserve">Given a correct scenario, what is the best way to implement it as production-quality automation?</w:t>
+            </w:r>
+            <w:r>
+              <w:rPr>
+                <w:iCs/>
+                <w:i/>
+              </w:rPr>
+              <w:t xml:space="preserve">”</w:t>
+            </w:r>
+          </w:p>
+        </w:tc>
+        <w:tc>
+          <w:tcPr/>
+          <w:p>
+            <w:pPr>
+              <w:pStyle w:val="Compact"/>
+              <w:jc w:val="left"/>
+            </w:pPr>
+            <w:r>
+              <w:t xml:space="preserve">Inside the Composer</w:t>
+            </w:r>
+          </w:p>
+        </w:tc>
+      </w:tr>
+    </w:tbl>
+    <w:p>
+      <w:pPr>
+        <w:pStyle w:val="BodyText"/>
+      </w:pPr>
+      <w:r>
+        <w:t xml:space="preserve">Together they give a stronger long-term foundation than continually expanding prompts or adding new</w:t>
+      </w:r>
+      <w:r>
+        <w:t xml:space="preserve"> </w:t>
+      </w:r>
+      <w:r>
+        <w:t xml:space="preserve">AI components: one certifies the</w:t>
+      </w:r>
+      <w:r>
+        <w:t xml:space="preserve"> </w:t>
+      </w:r>
+      <w:r>
+        <w:rPr>
+          <w:bCs/>
+          <w:b/>
+        </w:rPr>
+        <w:t xml:space="preserve">input</w:t>
+      </w:r>
+      <w:r>
+        <w:t xml:space="preserve">, the other governs the</w:t>
+      </w:r>
+      <w:r>
+        <w:t xml:space="preserve"> </w:t>
+      </w:r>
+      <w:r>
+        <w:rPr>
+          <w:bCs/>
+          <w:b/>
+        </w:rPr>
+        <w:t xml:space="preserve">implementation</w:t>
+      </w:r>
+      <w:r>
+        <w:t xml:space="preserve"> </w:t>
+      </w:r>
+      <w:r>
+        <w:t xml:space="preserve">— both</w:t>
+      </w:r>
+      <w:r>
+        <w:t xml:space="preserve"> </w:t>
+      </w:r>
+      <w:r>
+        <w:t xml:space="preserve">deterministic, both token-free, both versioned and unit-tested.</w:t>
+      </w:r>
+    </w:p>
+    <w:bookmarkStart w:id="46" w:name="engineering-heuristics-library"/>
+    <w:p>
+      <w:pPr>
+        <w:pStyle w:val="Heading3"/>
+      </w:pPr>
+      <w:r>
+        <w:t xml:space="preserve">5.1 Engineering Heuristics Library</w:t>
+      </w:r>
+    </w:p>
+    <w:p>
+      <w:pPr>
+        <w:pStyle w:val="FirstParagraph"/>
+      </w:pPr>
+      <w:r>
+        <w:t xml:space="preserve">Not another intelligence. A</w:t>
+      </w:r>
+      <w:r>
+        <w:t xml:space="preserve"> </w:t>
+      </w:r>
+      <w:r>
+        <w:rPr>
+          <w:bCs/>
+          <w:b/>
+        </w:rPr>
+        <w:t xml:space="preserve">deterministic rule library</w:t>
+      </w:r>
+      <w:r>
+        <w:t xml:space="preserve"> </w:t>
+      </w:r>
+      <w:r>
+        <w:t xml:space="preserve">that captures how experienced automation</w:t>
+      </w:r>
+      <w:r>
+        <w:t xml:space="preserve"> </w:t>
+      </w:r>
+      <w:r>
+        <w:t xml:space="preserve">engineers think. Every generation consults it.</w:t>
+      </w:r>
+      <w:r>
+        <w:t xml:space="preserve"> </w:t>
+      </w:r>
+      <w:r>
+        <w:rPr>
+          <w:bCs/>
+          <w:b/>
+        </w:rPr>
+        <w:t xml:space="preserve">No LLM. No prompt. No tokens.</w:t>
+      </w:r>
+      <w:r>
+        <w:t xml:space="preserve"> </w:t>
+      </w:r>
+      <w:r>
+        <w:t xml:space="preserve">It improves the</w:t>
+      </w:r>
+      <w:r>
+        <w:t xml:space="preserve"> </w:t>
+      </w:r>
+      <w:r>
+        <w:t xml:space="preserve">product over time without growing prompt size.</w:t>
+      </w:r>
+    </w:p>
+    <w:p>
+      <w:pPr>
+        <w:pStyle w:val="BodyText"/>
+      </w:pPr>
+      <w:r>
+        <w:rPr>
+          <w:bCs/>
+          <w:b/>
+        </w:rPr>
+        <w:t xml:space="preserve">Proposed home:</w:t>
+      </w:r>
+      <w:r>
+        <w:t xml:space="preserve"> </w:t>
+      </w:r>
+      <w:r>
+        <w:rPr>
+          <w:rStyle w:val="VerbatimChar"/>
+        </w:rPr>
+        <w:t xml:space="preserve">src/script-gen/heuristics/</w:t>
+      </w:r>
+      <w:r>
+        <w:t xml:space="preserve"> </w:t>
+      </w:r>
+      <w:r>
+        <w:t xml:space="preserve">(a pure, dependency-light rule module consumed by</w:t>
+      </w:r>
+      <w:r>
+        <w:t xml:space="preserve"> </w:t>
+      </w:r>
+      <w:r>
+        <w:rPr>
+          <w:rStyle w:val="VerbatimChar"/>
+        </w:rPr>
+        <w:t xml:space="preserve">ScriptGenEngine</w:t>
+      </w:r>
+      <w:r>
+        <w:t xml:space="preserve">). Rules are data + pure functions — unit-tested and versioned.</w:t>
+      </w:r>
+    </w:p>
+    <w:bookmarkEnd w:id="46"/>
+    <w:bookmarkStart w:id="47" w:name="rule-families"/>
+    <w:p>
+      <w:pPr>
+        <w:pStyle w:val="Heading3"/>
+      </w:pPr>
+      <w:r>
+        <w:t xml:space="preserve">Rule families</w:t>
+      </w:r>
+    </w:p>
+    <w:p>
+      <w:pPr>
+        <w:pStyle w:val="FirstParagraph"/>
+      </w:pPr>
+      <w:r>
+        <w:rPr>
+          <w:bCs/>
+          <w:b/>
+        </w:rPr>
+        <w:t xml:space="preserve">Locator heuristics</w:t>
+      </w:r>
+      <w:r>
+        <w:t xml:space="preserve"> </w:t>
+      </w:r>
+      <w:r>
+        <w:t xml:space="preserve">- Prefer existing page-object methods.</w:t>
+      </w:r>
+      <w:r>
+        <w:t xml:space="preserve"> </w:t>
+      </w:r>
+      <w:r>
+        <w:t xml:space="preserve">- Prefer</w:t>
+      </w:r>
+      <w:r>
+        <w:t xml:space="preserve"> </w:t>
+      </w:r>
+      <w:r>
+        <w:rPr>
+          <w:rStyle w:val="VerbatimChar"/>
+        </w:rPr>
+        <w:t xml:space="preserve">data-testid</w:t>
+      </w:r>
+      <w:r>
+        <w:t xml:space="preserve">.</w:t>
+      </w:r>
+      <w:r>
+        <w:t xml:space="preserve"> </w:t>
+      </w:r>
+      <w:r>
+        <w:t xml:space="preserve">- Prefer accessible roles and names.</w:t>
+      </w:r>
+      <w:r>
+        <w:t xml:space="preserve"> </w:t>
+      </w:r>
+      <w:r>
+        <w:t xml:space="preserve">- Avoid brittle CSS / XPath unless necessary.</w:t>
+      </w:r>
+    </w:p>
+    <w:p>
+      <w:pPr>
+        <w:pStyle w:val="BodyText"/>
+      </w:pPr>
+      <w:r>
+        <w:rPr>
+          <w:bCs/>
+          <w:b/>
+        </w:rPr>
+        <w:t xml:space="preserve">Assertion heuristics</w:t>
+      </w:r>
+      <w:r>
+        <w:t xml:space="preserve"> </w:t>
+      </w:r>
+      <w:r>
+        <w:t xml:space="preserve">- Verify business outcome first.</w:t>
+      </w:r>
+      <w:r>
+        <w:t xml:space="preserve"> </w:t>
+      </w:r>
+      <w:r>
+        <w:t xml:space="preserve">- Add one or two stability assertions.</w:t>
+      </w:r>
+      <w:r>
+        <w:t xml:space="preserve"> </w:t>
+      </w:r>
+      <w:r>
+        <w:t xml:space="preserve">- Don’t generate redundant assertions.</w:t>
+      </w:r>
+    </w:p>
+    <w:p>
+      <w:pPr>
+        <w:pStyle w:val="BodyText"/>
+      </w:pPr>
+      <w:r>
+        <w:rPr>
+          <w:bCs/>
+          <w:b/>
+        </w:rPr>
+        <w:t xml:space="preserve">Framework heuristics</w:t>
+      </w:r>
+      <w:r>
+        <w:t xml:space="preserve"> </w:t>
+      </w:r>
+      <w:r>
+        <w:t xml:space="preserve">- Reuse existing fixtures.</w:t>
+      </w:r>
+      <w:r>
+        <w:t xml:space="preserve"> </w:t>
+      </w:r>
+      <w:r>
+        <w:t xml:space="preserve">- Reuse page-object methods.</w:t>
+      </w:r>
+      <w:r>
+        <w:t xml:space="preserve"> </w:t>
+      </w:r>
+      <w:r>
+        <w:t xml:space="preserve">- Don’t create duplicate utilities.</w:t>
+      </w:r>
+    </w:p>
+    <w:p>
+      <w:pPr>
+        <w:pStyle w:val="BodyText"/>
+      </w:pPr>
+      <w:r>
+        <w:rPr>
+          <w:bCs/>
+          <w:b/>
+        </w:rPr>
+        <w:t xml:space="preserve">Naming heuristics</w:t>
+      </w:r>
+      <w:r>
+        <w:t xml:space="preserve"> </w:t>
+      </w:r>
+      <w:r>
+        <w:t xml:space="preserve">- Follow the project’s existing naming conventions.</w:t>
+      </w:r>
+      <w:r>
+        <w:t xml:space="preserve"> </w:t>
+      </w:r>
+      <w:r>
+        <w:t xml:space="preserve">- Avoid identical/templated names everywhere.</w:t>
+      </w:r>
+    </w:p>
+    <w:p>
+      <w:pPr>
+        <w:pStyle w:val="BodyText"/>
+      </w:pPr>
+      <w:r>
+        <w:rPr>
+          <w:bCs/>
+          <w:b/>
+        </w:rPr>
+        <w:t xml:space="preserve">Playwright heuristics</w:t>
+      </w:r>
+      <w:r>
+        <w:t xml:space="preserve"> </w:t>
+      </w:r>
+      <w:r>
+        <w:t xml:space="preserve">- No</w:t>
+      </w:r>
+      <w:r>
+        <w:t xml:space="preserve"> </w:t>
+      </w:r>
+      <w:r>
+        <w:rPr>
+          <w:rStyle w:val="VerbatimChar"/>
+        </w:rPr>
+        <w:t xml:space="preserve">waitForTimeout</w:t>
+      </w:r>
+      <w:r>
+        <w:t xml:space="preserve">; use web-first assertions and auto-waiting.</w:t>
+      </w:r>
+      <w:r>
+        <w:t xml:space="preserve"> </w:t>
+      </w:r>
+      <w:r>
+        <w:t xml:space="preserve">- Prefer user-facing locators (</w:t>
+      </w:r>
+      <w:r>
+        <w:rPr>
+          <w:rStyle w:val="VerbatimChar"/>
+        </w:rPr>
+        <w:t xml:space="preserve">getByRole</w:t>
+      </w:r>
+      <w:r>
+        <w:t xml:space="preserve"> </w:t>
+      </w:r>
+      <w:r>
+        <w:t xml:space="preserve">/</w:t>
+      </w:r>
+      <w:r>
+        <w:t xml:space="preserve"> </w:t>
+      </w:r>
+      <w:r>
+        <w:rPr>
+          <w:rStyle w:val="VerbatimChar"/>
+        </w:rPr>
+        <w:t xml:space="preserve">getByLabel</w:t>
+      </w:r>
+      <w:r>
+        <w:t xml:space="preserve">).</w:t>
+      </w:r>
+    </w:p>
+    <w:p>
+      <w:pPr>
+        <w:pStyle w:val="BodyText"/>
+      </w:pPr>
+      <w:r>
+        <w:t xml:space="preserve">These heuristics evolve over time (Sprint 7+</w:t>
+      </w:r>
+      <w:r>
+        <w:t xml:space="preserve"> </w:t>
+      </w:r>
+      <w:r>
+        <w:t xml:space="preserve">“</w:t>
+      </w:r>
+      <w:r>
+        <w:t xml:space="preserve">continuous learning</w:t>
+      </w:r>
+      <w:r>
+        <w:t xml:space="preserve">”</w:t>
+      </w:r>
+      <w:r>
+        <w:t xml:space="preserve"> </w:t>
+      </w:r>
+      <w:r>
+        <w:t xml:space="preserve">improves the weights from</w:t>
+      </w:r>
+      <w:r>
+        <w:t xml:space="preserve"> </w:t>
+      </w:r>
+      <w:r>
+        <w:t xml:space="preserve">successful generations) —</w:t>
+      </w:r>
+      <w:r>
+        <w:t xml:space="preserve"> </w:t>
+      </w:r>
+      <w:r>
+        <w:rPr>
+          <w:bCs/>
+          <w:b/>
+        </w:rPr>
+        <w:t xml:space="preserve">without</w:t>
+      </w:r>
+      <w:r>
+        <w:t xml:space="preserve"> </w:t>
+      </w:r>
+      <w:r>
+        <w:t xml:space="preserve">increasing token usage or architectural complexity.</w:t>
+      </w:r>
+    </w:p>
+    <w:p>
+      <w:r>
+        <w:pict>
+          <v:rect style="width:0;height:1.5pt" o:hralign="center" o:hrstd="t" o:hr="t"/>
+        </w:pict>
+      </w:r>
+    </w:p>
+    <w:bookmarkEnd w:id="47"/>
+    <w:bookmarkEnd w:id="48"/>
+    <w:bookmarkStart w:id="49" w:name="long-term-stable-roadmap"/>
+    <w:p>
+      <w:pPr>
+        <w:pStyle w:val="Heading2"/>
+      </w:pPr>
+      <w:r>
+        <w:t xml:space="preserve">6. Long-term stable roadmap</w:t>
+      </w:r>
+    </w:p>
+    <w:tbl>
+      <w:tblPr>
+        <w:tblStyle w:val="Table"/>
+        <w:tblW w:type="pct" w:w="5000"/>
+        <w:tblLook w:firstRow="1" w:lastRow="0" w:firstColumn="0" w:lastColumn="0" w:noHBand="0" w:noVBand="0" w:val="0020"/>
+      </w:tblPr>
+      <w:tblGrid>
+        <w:gridCol w:w="2640"/>
+        <w:gridCol w:w="2640"/>
+        <w:gridCol w:w="2640"/>
+      </w:tblGrid>
+      <w:tr>
+        <w:trPr>
+          <w:tblHeader w:val="true"/>
+        </w:trPr>
+        <w:tc>
+          <w:tcPr/>
+          <w:p>
+            <w:pPr>
+              <w:pStyle w:val="Compact"/>
+              <w:jc w:val="left"/>
+            </w:pPr>
+            <w:r>
+              <w:t xml:space="preserve">Phase</w:t>
+            </w:r>
+          </w:p>
+        </w:tc>
+        <w:tc>
+          <w:tcPr/>
+          <w:p>
+            <w:pPr>
+              <w:pStyle w:val="Compact"/>
+              <w:jc w:val="left"/>
+            </w:pPr>
+            <w:r>
+              <w:t xml:space="preserve">Goal</w:t>
+            </w:r>
+          </w:p>
+        </w:tc>
+        <w:tc>
+          <w:tcPr/>
+          <w:p>
+            <w:pPr>
+              <w:pStyle w:val="Compact"/>
+              <w:jc w:val="left"/>
+            </w:pPr>
+            <w:r>
+              <w:t xml:space="preserve">Change type</w:t>
+            </w:r>
+          </w:p>
+        </w:tc>
+      </w:tr>
+      <w:tr>
+        <w:tc>
+          <w:tcPr/>
+          <w:p>
+            <w:pPr>
+              <w:pStyle w:val="Compact"/>
+              <w:jc w:val="left"/>
+            </w:pPr>
+            <w:r>
               <w:t xml:space="preserve">1</w:t>
             </w:r>
           </w:p>
@@ -4240,6 +5809,56 @@
             </w:pPr>
             <w:r>
               <w:t xml:space="preserve">Regression fix + freeze declaration</w:t>
+            </w:r>
+          </w:p>
+        </w:tc>
+      </w:tr>
+      <w:tr>
+        <w:tc>
+          <w:tcPr/>
+          <w:p>
+            <w:pPr>
+              <w:pStyle w:val="Compact"/>
+              <w:jc w:val="left"/>
+            </w:pPr>
+            <w:r>
+              <w:rPr>
+                <w:bCs/>
+                <w:b/>
+              </w:rPr>
+              <w:t xml:space="preserve">1.5</w:t>
+            </w:r>
+          </w:p>
+        </w:tc>
+        <w:tc>
+          <w:tcPr/>
+          <w:p>
+            <w:pPr>
+              <w:pStyle w:val="Compact"/>
+              <w:jc w:val="left"/>
+            </w:pPr>
+            <w:r>
+              <w:rPr>
+                <w:bCs/>
+                <w:b/>
+              </w:rPr>
+              <w:t xml:space="preserve">Scenario Integrity Engine</w:t>
+            </w:r>
+          </w:p>
+        </w:tc>
+        <w:tc>
+          <w:tcPr/>
+          <w:p>
+            <w:pPr>
+              <w:pStyle w:val="Compact"/>
+              <w:jc w:val="left"/>
+            </w:pPr>
+            <w:r>
+              <w:rPr>
+                <w:bCs/>
+                <w:b/>
+              </w:rPr>
+              <w:t xml:space="preserve">Certify the scenario (readiness score + warnings); never mutate</w:t>
             </w:r>
           </w:p>
         </w:tc>
@@ -4555,8 +6174,8 @@
         </w:pict>
       </w:r>
     </w:p>
-    <w:bookmarkEnd w:id="43"/>
-    <w:bookmarkStart w:id="44" w:name="X719dfcafdc4a0823b504c2a6055373223c56631"/>
+    <w:bookmarkEnd w:id="49"/>
+    <w:bookmarkStart w:id="50" w:name="X719dfcafdc4a0823b504c2a6055373223c56631"/>
     <w:p>
       <w:pPr>
         <w:pStyle w:val="Heading2"/>
@@ -4569,7 +6188,7 @@
       <w:pPr>
         <w:numPr>
           <w:ilvl w:val="0"/>
-          <w:numId w:val="1008"/>
+          <w:numId w:val="1016"/>
         </w:numPr>
         <w:pStyle w:val="Compact"/>
       </w:pPr>
@@ -4603,7 +6222,7 @@
       <w:pPr>
         <w:numPr>
           <w:ilvl w:val="0"/>
-          <w:numId w:val="1008"/>
+          <w:numId w:val="1016"/>
         </w:numPr>
         <w:pStyle w:val="Compact"/>
       </w:pPr>
@@ -4631,7 +6250,7 @@
       <w:pPr>
         <w:numPr>
           <w:ilvl w:val="0"/>
-          <w:numId w:val="1008"/>
+          <w:numId w:val="1016"/>
         </w:numPr>
         <w:pStyle w:val="Compact"/>
       </w:pPr>
@@ -4643,7 +6262,7 @@
       <w:pPr>
         <w:numPr>
           <w:ilvl w:val="0"/>
-          <w:numId w:val="1008"/>
+          <w:numId w:val="1016"/>
         </w:numPr>
         <w:pStyle w:val="Compact"/>
       </w:pPr>
@@ -4671,7 +6290,7 @@
       <w:pPr>
         <w:numPr>
           <w:ilvl w:val="0"/>
-          <w:numId w:val="1008"/>
+          <w:numId w:val="1016"/>
         </w:numPr>
         <w:pStyle w:val="Compact"/>
       </w:pPr>
@@ -4683,7 +6302,7 @@
       <w:pPr>
         <w:numPr>
           <w:ilvl w:val="0"/>
-          <w:numId w:val="1008"/>
+          <w:numId w:val="1016"/>
         </w:numPr>
         <w:pStyle w:val="Compact"/>
       </w:pPr>
@@ -4695,7 +6314,7 @@
       <w:pPr>
         <w:numPr>
           <w:ilvl w:val="0"/>
-          <w:numId w:val="1008"/>
+          <w:numId w:val="1016"/>
         </w:numPr>
         <w:pStyle w:val="Compact"/>
       </w:pPr>
@@ -4761,7 +6380,7 @@
       <w:pPr>
         <w:numPr>
           <w:ilvl w:val="0"/>
-          <w:numId w:val="1008"/>
+          <w:numId w:val="1016"/>
         </w:numPr>
         <w:pStyle w:val="Compact"/>
       </w:pPr>
@@ -4785,8 +6404,8 @@
         </w:pict>
       </w:r>
     </w:p>
-    <w:bookmarkEnd w:id="44"/>
-    <w:bookmarkStart w:id="45" w:name="appendix-component-map-as-of-v1.0"/>
+    <w:bookmarkEnd w:id="50"/>
+    <w:bookmarkStart w:id="51" w:name="appendix-component-map-as-of-v1.0"/>
     <w:p>
       <w:pPr>
         <w:pStyle w:val="Heading2"/>
@@ -4812,6 +6431,15 @@
         <w:rPr>
           <w:rStyle w:val="VerbatimChar"/>
         </w:rPr>
+        <w:t xml:space="preserve">src/engines/scenario-integrity/ (proposed) Scenario Integrity Engine → Sprint 1.5 / §5</w:t>
+      </w:r>
+      <w:r>
+        <w:br/>
+      </w:r>
+      <w:r>
+        <w:rPr>
+          <w:rStyle w:val="VerbatimChar"/>
+        </w:rPr>
         <w:t xml:space="preserve">src/renderers/scenario-renderer.ts         Manual / Script / BDD projection (Phase B)</w:t>
       </w:r>
       <w:r>
@@ -4941,8 +6569,8 @@
         <w:t xml:space="preserve">src/script-gen/heuristics/  (proposed)     Engineering Heuristics Library → §5</w:t>
       </w:r>
     </w:p>
-    <w:bookmarkEnd w:id="45"/>
-    <w:bookmarkEnd w:id="46"/>
+    <w:bookmarkEnd w:id="51"/>
+    <w:bookmarkEnd w:id="52"/>
     <w:sectPr/>
   </w:body>
 </w:document>
@@ -5262,6 +6890,57 @@
     <w:abstractNumId w:val="991"/>
   </w:num>
   <w:num w:numId="1008">
+    <w:abstractNumId w:val="991"/>
+  </w:num>
+  <w:num w:numId="1009">
+    <w:abstractNumId w:val="991"/>
+  </w:num>
+  <w:num w:numId="1010">
+    <w:abstractNumId w:val="991"/>
+  </w:num>
+  <w:num w:numId="1011">
+    <w:abstractNumId w:val="991"/>
+  </w:num>
+  <w:num w:numId="1012">
+    <w:abstractNumId w:val="99411"/>
+    <w:lvlOverride w:ilvl="0">
+      <w:startOverride w:val="1"/>
+    </w:lvlOverride>
+    <w:lvlOverride w:ilvl="1">
+      <w:startOverride w:val="1"/>
+    </w:lvlOverride>
+    <w:lvlOverride w:ilvl="2">
+      <w:startOverride w:val="1"/>
+    </w:lvlOverride>
+    <w:lvlOverride w:ilvl="3">
+      <w:startOverride w:val="1"/>
+    </w:lvlOverride>
+    <w:lvlOverride w:ilvl="4">
+      <w:startOverride w:val="1"/>
+    </w:lvlOverride>
+    <w:lvlOverride w:ilvl="5">
+      <w:startOverride w:val="1"/>
+    </w:lvlOverride>
+    <w:lvlOverride w:ilvl="6">
+      <w:startOverride w:val="1"/>
+    </w:lvlOverride>
+    <w:lvlOverride w:ilvl="7">
+      <w:startOverride w:val="1"/>
+    </w:lvlOverride>
+    <w:lvlOverride w:ilvl="8">
+      <w:startOverride w:val="1"/>
+    </w:lvlOverride>
+  </w:num>
+  <w:num w:numId="1013">
+    <w:abstractNumId w:val="991"/>
+  </w:num>
+  <w:num w:numId="1014">
+    <w:abstractNumId w:val="991"/>
+  </w:num>
+  <w:num w:numId="1015">
+    <w:abstractNumId w:val="991"/>
+  </w:num>
+  <w:num w:numId="1016">
     <w:abstractNumId w:val="991"/>
   </w:num>
 </w:numbering>

</xml_diff>

<commit_message>
heuristic: minimize logging to spend tokens on quality
Add Logging Heuristics to Engineering Heuristics Library (§5.1):
- Minimize logging — logs waste tokens that could improve assertions, waits, locators
- Default: log only test start/end + critical decision points, not every step
- Every log must justify its existence vs. adding an assertion/refining a locator

Context: user feedback that generated scripts have excessive logging bloat
(e.g., logging every single step action). Tokens spent on logs reduce
token budget for quality fundamentals: better assertions, explicit waits,
resilient locators. This heuristic ensures future Script Composer
refinements (Sprint 5 Humanization, ongoing tuning) prioritize substance
over noise.

Docs-only. No code changes. Sprint 2+ implementations will respect this.
</commit_message>
<xml_diff>
--- a/SCRIPT_COMPOSER_EVOLUTION.docx
+++ b/SCRIPT_COMPOSER_EVOLUTION.docx
@@ -8054,6 +8054,36 @@
       </w:r>
       <w:r>
         <w:t xml:space="preserve">).</w:t>
+      </w:r>
+    </w:p>
+    <w:p>
+      <w:pPr>
+        <w:pStyle w:val="BodyText"/>
+      </w:pPr>
+      <w:r>
+        <w:rPr>
+          <w:bCs/>
+          <w:b/>
+        </w:rPr>
+        <w:t xml:space="preserve">Logging heuristics</w:t>
+      </w:r>
+      <w:r>
+        <w:t xml:space="preserve"> </w:t>
+      </w:r>
+      <w:r>
+        <w:t xml:space="preserve">- Minimize logging statements — logs waste tokens that could improve assertions, waits, or locators.</w:t>
+      </w:r>
+      <w:r>
+        <w:t xml:space="preserve"> </w:t>
+      </w:r>
+      <w:r>
+        <w:t xml:space="preserve">- Default: log only test start/end and critical decision points, not every step.</w:t>
+      </w:r>
+      <w:r>
+        <w:t xml:space="preserve"> </w:t>
+      </w:r>
+      <w:r>
+        <w:t xml:space="preserve">- Every log must justify its existence vs. adding an assertion or refining a locator.</w:t>
       </w:r>
     </w:p>
     <w:p>

</xml_diff>